<commit_message>
index update for landing page to publish site
</commit_message>
<xml_diff>
--- a/Documentation/Project Breif.docx
+++ b/Documentation/Project Breif.docx
@@ -650,6 +650,39 @@
         <w:rPr>
           <w:b/>
         </w:rPr>
+        <w:t>Where is my interface made to be used?</w:t>
+      </w:r>
+    </w:p>
+    <w:p>
+      <w:pPr>
+        <w:pStyle w:val="ListParagraph"/>
+        <w:numPr>
+          <w:ilvl w:val="0"/>
+          <w:numId w:val="7"/>
+        </w:numPr>
+        <w:spacing w:after="40" w:line="276" w:lineRule="auto"/>
+        <w:rPr>
+          <w:b/>
+        </w:rPr>
+      </w:pPr>
+      <w:r>
+        <w:rPr>
+          <w:b/>
+        </w:rPr>
+        <w:t>My interface will be made to be used on both large desktop screens and small mobile devices because I will build in responsive elements that make the interface able to be displayed on these.</w:t>
+      </w:r>
+    </w:p>
+    <w:p>
+      <w:pPr>
+        <w:spacing w:after="40" w:line="276" w:lineRule="auto"/>
+        <w:rPr>
+          <w:b/>
+        </w:rPr>
+      </w:pPr>
+      <w:r>
+        <w:rPr>
+          <w:b/>
+        </w:rPr>
         <w:t>What are my relevant implications?</w:t>
       </w:r>
     </w:p>
@@ -924,6 +957,7 @@
         </w:numPr>
       </w:pPr>
       <w:r>
+        <w:lastRenderedPageBreak/>
         <w:t xml:space="preserve">The interface should track average confidence level </w:t>
       </w:r>
     </w:p>
@@ -953,7 +987,6 @@
         </w:numPr>
       </w:pPr>
       <w:r>
-        <w:lastRenderedPageBreak/>
         <w:t>Ability to input stock holdings by value and share size</w:t>
       </w:r>
     </w:p>
@@ -1444,7 +1477,11 @@
         <w:t>I used</w:t>
       </w:r>
       <w:r>
-        <w:t xml:space="preserve"> Trello to write up the various different tasks I had to do for each phase. And then at the end of those phases, I did a reflection, reviewing the tasks an completed and what I didn’t get to. If these </w:t>
+        <w:t xml:space="preserve"> Trello to write up the various different tasks I had to do for each phase. And then at the end of those phases, I did a reflection, reviewing the tasks an completed and what I </w:t>
+      </w:r>
+      <w:r>
+        <w:lastRenderedPageBreak/>
+        <w:t xml:space="preserve">didn’t get to. If these </w:t>
       </w:r>
       <w:r>
         <w:t>objectives were incomplete within their planned phase, I moved them to the next one or removed them if they would be too time consuming to complete.</w:t>
@@ -1455,11 +1492,15 @@
         <w:t xml:space="preserve">I also maintained a detailed, dated worklog throughout my development as a way to show </w:t>
       </w:r>
       <w:r>
-        <w:t xml:space="preserve">my development and debug process as I completed, rather than ticking off individual things </w:t>
+        <w:t xml:space="preserve">my development and debug process as I completed, rather than ticking off individual things on my Trello as I went. My testing tables also have dated records of testing, problems found, changes made (with links back to worklog for debug if necessary), and retests. </w:t>
       </w:r>
+      <w:proofErr w:type="spellStart"/>
       <w:r>
-        <w:lastRenderedPageBreak/>
-        <w:t>on my Trello as I went. My testing tables also have dated records of testing, problems found, changes made (with links back to worklog for debug if necessary), and retests. Github shows my VS code commit history.</w:t>
+        <w:t>Github</w:t>
+      </w:r>
+      <w:proofErr w:type="spellEnd"/>
+      <w:r>
+        <w:t xml:space="preserve"> shows my VS code commit history.</w:t>
       </w:r>
     </w:p>
     <w:p>
@@ -1514,6 +1555,78 @@
     </w:p>
     <w:p>
       <w:pPr>
+        <w:pStyle w:val="ListParagraph"/>
+        <w:numPr>
+          <w:ilvl w:val="0"/>
+          <w:numId w:val="2"/>
+        </w:numPr>
+      </w:pPr>
+      <w:r>
+        <w:t xml:space="preserve">I also used Netlify </w:t>
+      </w:r>
+      <w:hyperlink r:id="rId14" w:history="1">
+        <w:r>
+          <w:rPr>
+            <w:rStyle w:val="Hyperlink"/>
+          </w:rPr>
+          <w:t>Stakeholder flashcards · AS91893 · AS91897</w:t>
+        </w:r>
+      </w:hyperlink>
+      <w:r>
+        <w:t xml:space="preserve"> </w:t>
+      </w:r>
+      <w:r>
+        <w:t>for both standards to ensure that I was hitting all of the relevant criteria, and ticked off the things I had done as I went.</w:t>
+      </w:r>
+    </w:p>
+    <w:p>
+      <w:pPr>
+        <w:pStyle w:val="ListParagraph"/>
+        <w:numPr>
+          <w:ilvl w:val="0"/>
+          <w:numId w:val="2"/>
+        </w:numPr>
+      </w:pPr>
+      <w:r>
+        <w:t xml:space="preserve">And my </w:t>
+      </w:r>
+      <w:proofErr w:type="spellStart"/>
+      <w:r>
+        <w:t>github</w:t>
+      </w:r>
+      <w:proofErr w:type="spellEnd"/>
+      <w:r>
+        <w:t xml:space="preserve"> link: </w:t>
+      </w:r>
+      <w:hyperlink r:id="rId15" w:history="1">
+        <w:r>
+          <w:rPr>
+            <w:rStyle w:val="Hyperlink"/>
+          </w:rPr>
+          <w:t>OSCAR</w:t>
+        </w:r>
+        <w:r>
+          <w:rPr>
+            <w:rStyle w:val="Hyperlink"/>
+          </w:rPr>
+          <w:t>B</w:t>
+        </w:r>
+        <w:r>
+          <w:rPr>
+            <w:rStyle w:val="Hyperlink"/>
+          </w:rPr>
+          <w:t>123123/Standard-2</w:t>
+        </w:r>
+      </w:hyperlink>
+    </w:p>
+    <w:p>
+      <w:r>
+        <w:t>This first image is a picture of my Figma project, which I used to get an initial idea of what I wanted my interface to look like, however its now deleted. So is the second image.</w:t>
+      </w:r>
+    </w:p>
+    <w:p/>
+    <w:p>
+      <w:pPr>
         <w:rPr>
           <w:noProof/>
         </w:rPr>
@@ -1523,7 +1636,7 @@
           <w:noProof/>
         </w:rPr>
         <w:drawing>
-          <wp:inline distT="0" distB="0" distL="0" distR="0" wp14:anchorId="7D7B389E" wp14:editId="7B37F962">
+          <wp:inline distT="0" distB="0" distL="0" distR="0" wp14:anchorId="7D7B389E" wp14:editId="084CAA2B">
             <wp:extent cx="1829857" cy="1116855"/>
             <wp:effectExtent l="0" t="0" r="0" b="7620"/>
             <wp:docPr id="2099634707" name="Picture 1"/>
@@ -1538,7 +1651,7 @@
                     <pic:cNvPicPr/>
                   </pic:nvPicPr>
                   <pic:blipFill>
-                    <a:blip r:embed="rId14" cstate="print">
+                    <a:blip r:embed="rId16" cstate="print">
                       <a:extLst>
                         <a:ext uri="{28A0092B-C50C-407E-A947-70E740481C1C}">
                           <a14:useLocalDpi xmlns:a14="http://schemas.microsoft.com/office/drawing/2010/main" val="0"/>
@@ -1584,7 +1697,7 @@
                     <pic:cNvPicPr/>
                   </pic:nvPicPr>
                   <pic:blipFill>
-                    <a:blip r:embed="rId15" cstate="print">
+                    <a:blip r:embed="rId17" cstate="print">
                       <a:extLst>
                         <a:ext uri="{28A0092B-C50C-407E-A947-70E740481C1C}">
                           <a14:useLocalDpi xmlns:a14="http://schemas.microsoft.com/office/drawing/2010/main" val="0"/>
@@ -1610,12 +1723,189 @@
           </wp:inline>
         </w:drawing>
       </w:r>
+    </w:p>
+    <w:p>
+      <w:pPr>
+        <w:rPr>
+          <w:noProof/>
+        </w:rPr>
+      </w:pPr>
       <w:r>
         <w:rPr>
           <w:noProof/>
         </w:rPr>
         <w:drawing>
-          <wp:inline distT="0" distB="0" distL="0" distR="0" wp14:anchorId="3EFF766E" wp14:editId="696F202B">
+          <wp:anchor distT="0" distB="0" distL="114300" distR="114300" simplePos="0" relativeHeight="252048384" behindDoc="0" locked="0" layoutInCell="1" allowOverlap="1" wp14:anchorId="4520F214" wp14:editId="34DF7FEF">
+            <wp:simplePos x="0" y="0"/>
+            <wp:positionH relativeFrom="column">
+              <wp:posOffset>181816</wp:posOffset>
+            </wp:positionH>
+            <wp:positionV relativeFrom="paragraph">
+              <wp:posOffset>73231</wp:posOffset>
+            </wp:positionV>
+            <wp:extent cx="1811655" cy="1266190"/>
+            <wp:effectExtent l="0" t="0" r="0" b="0"/>
+            <wp:wrapSquare wrapText="bothSides"/>
+            <wp:docPr id="2093103598" name="Picture 1"/>
+            <wp:cNvGraphicFramePr>
+              <a:graphicFrameLocks xmlns:a="http://schemas.openxmlformats.org/drawingml/2006/main" noChangeAspect="1"/>
+            </wp:cNvGraphicFramePr>
+            <a:graphic xmlns:a="http://schemas.openxmlformats.org/drawingml/2006/main">
+              <a:graphicData uri="http://schemas.openxmlformats.org/drawingml/2006/picture">
+                <pic:pic xmlns:pic="http://schemas.openxmlformats.org/drawingml/2006/picture">
+                  <pic:nvPicPr>
+                    <pic:cNvPr id="2093103598" name=""/>
+                    <pic:cNvPicPr/>
+                  </pic:nvPicPr>
+                  <pic:blipFill>
+                    <a:blip r:embed="rId18"/>
+                    <a:stretch>
+                      <a:fillRect/>
+                    </a:stretch>
+                  </pic:blipFill>
+                  <pic:spPr>
+                    <a:xfrm>
+                      <a:off x="0" y="0"/>
+                      <a:ext cx="1811655" cy="1266190"/>
+                    </a:xfrm>
+                    <a:prstGeom prst="rect">
+                      <a:avLst/>
+                    </a:prstGeom>
+                  </pic:spPr>
+                </pic:pic>
+              </a:graphicData>
+            </a:graphic>
+            <wp14:sizeRelH relativeFrom="margin">
+              <wp14:pctWidth>0</wp14:pctWidth>
+            </wp14:sizeRelH>
+            <wp14:sizeRelV relativeFrom="margin">
+              <wp14:pctHeight>0</wp14:pctHeight>
+            </wp14:sizeRelV>
+          </wp:anchor>
+        </w:drawing>
+      </w:r>
+      <w:r>
+        <w:rPr>
+          <w:noProof/>
+        </w:rPr>
+        <w:drawing>
+          <wp:anchor distT="0" distB="0" distL="114300" distR="114300" simplePos="0" relativeHeight="252050432" behindDoc="0" locked="0" layoutInCell="1" allowOverlap="1" wp14:anchorId="50A753F6" wp14:editId="6B0D2606">
+            <wp:simplePos x="0" y="0"/>
+            <wp:positionH relativeFrom="margin">
+              <wp:align>center</wp:align>
+            </wp:positionH>
+            <wp:positionV relativeFrom="paragraph">
+              <wp:posOffset>7482</wp:posOffset>
+            </wp:positionV>
+            <wp:extent cx="1593850" cy="1316355"/>
+            <wp:effectExtent l="0" t="0" r="6350" b="0"/>
+            <wp:wrapSquare wrapText="bothSides"/>
+            <wp:docPr id="1918523316" name="Picture 1"/>
+            <wp:cNvGraphicFramePr>
+              <a:graphicFrameLocks xmlns:a="http://schemas.openxmlformats.org/drawingml/2006/main" noChangeAspect="1"/>
+            </wp:cNvGraphicFramePr>
+            <a:graphic xmlns:a="http://schemas.openxmlformats.org/drawingml/2006/main">
+              <a:graphicData uri="http://schemas.openxmlformats.org/drawingml/2006/picture">
+                <pic:pic xmlns:pic="http://schemas.openxmlformats.org/drawingml/2006/picture">
+                  <pic:nvPicPr>
+                    <pic:cNvPr id="1918523316" name=""/>
+                    <pic:cNvPicPr/>
+                  </pic:nvPicPr>
+                  <pic:blipFill>
+                    <a:blip r:embed="rId19"/>
+                    <a:stretch>
+                      <a:fillRect/>
+                    </a:stretch>
+                  </pic:blipFill>
+                  <pic:spPr>
+                    <a:xfrm>
+                      <a:off x="0" y="0"/>
+                      <a:ext cx="1593850" cy="1316355"/>
+                    </a:xfrm>
+                    <a:prstGeom prst="rect">
+                      <a:avLst/>
+                    </a:prstGeom>
+                  </pic:spPr>
+                </pic:pic>
+              </a:graphicData>
+            </a:graphic>
+            <wp14:sizeRelH relativeFrom="margin">
+              <wp14:pctWidth>0</wp14:pctWidth>
+            </wp14:sizeRelH>
+            <wp14:sizeRelV relativeFrom="margin">
+              <wp14:pctHeight>0</wp14:pctHeight>
+            </wp14:sizeRelV>
+          </wp:anchor>
+        </w:drawing>
+      </w:r>
+    </w:p>
+    <w:p>
+      <w:pPr>
+        <w:rPr>
+          <w:noProof/>
+        </w:rPr>
+      </w:pPr>
+    </w:p>
+    <w:p>
+      <w:pPr>
+        <w:rPr>
+          <w:noProof/>
+        </w:rPr>
+      </w:pPr>
+    </w:p>
+    <w:p>
+      <w:pPr>
+        <w:rPr>
+          <w:noProof/>
+        </w:rPr>
+      </w:pPr>
+    </w:p>
+    <w:p>
+      <w:pPr>
+        <w:rPr>
+          <w:noProof/>
+        </w:rPr>
+      </w:pPr>
+    </w:p>
+    <w:p>
+      <w:pPr>
+        <w:rPr>
+          <w:noProof/>
+        </w:rPr>
+      </w:pPr>
+    </w:p>
+    <w:p>
+      <w:pPr>
+        <w:rPr>
+          <w:noProof/>
+        </w:rPr>
+      </w:pPr>
+      <w:r>
+        <w:rPr>
+          <w:noProof/>
+        </w:rPr>
+        <w:lastRenderedPageBreak/>
+        <w:t xml:space="preserve">20/7/26: this is an image of how my trello board initially started out, I was using it for a to do list with the different netlify objectives in the to do collum, I then had a doing and a done collum to sort </w:t>
+      </w:r>
+      <w:r>
+        <w:rPr>
+          <w:noProof/>
+        </w:rPr>
+        <w:t>these cards as I compelted them.</w:t>
+      </w:r>
+    </w:p>
+    <w:p>
+      <w:pPr>
+        <w:rPr>
+          <w:noProof/>
+        </w:rPr>
+      </w:pPr>
+      <w:r>
+        <w:rPr>
+          <w:noProof/>
+        </w:rPr>
+        <w:drawing>
+          <wp:inline distT="0" distB="0" distL="0" distR="0" wp14:anchorId="3C54A12F" wp14:editId="15B85FAB">
             <wp:extent cx="1561949" cy="1180409"/>
             <wp:effectExtent l="0" t="0" r="635" b="1270"/>
             <wp:docPr id="389821792" name="Picture 1"/>
@@ -1630,7 +1920,7 @@
                     <pic:cNvPicPr/>
                   </pic:nvPicPr>
                   <pic:blipFill>
-                    <a:blip r:embed="rId16" cstate="print">
+                    <a:blip r:embed="rId20" cstate="print">
                       <a:extLst>
                         <a:ext uri="{28A0092B-C50C-407E-A947-70E740481C1C}">
                           <a14:useLocalDpi xmlns:a14="http://schemas.microsoft.com/office/drawing/2010/main" val="0"/>
@@ -1656,12 +1946,135 @@
           </wp:inline>
         </w:drawing>
       </w:r>
+    </w:p>
+    <w:p>
+      <w:pPr>
+        <w:rPr>
+          <w:noProof/>
+        </w:rPr>
+      </w:pPr>
+    </w:p>
+    <w:p>
+      <w:pPr>
+        <w:rPr>
+          <w:noProof/>
+        </w:rPr>
+      </w:pPr>
       <w:r>
         <w:rPr>
           <w:noProof/>
         </w:rPr>
-        <w:t xml:space="preserve"> </w:t>
+        <w:t xml:space="preserve">Below is an image of my trello board much later on. I have the </w:t>
       </w:r>
+      <w:r>
+        <w:rPr>
+          <w:noProof/>
+        </w:rPr>
+        <w:t>different phases as separate boxes on the trello board, with them filled with the various objectives I need to do. I also have my component breakdown with smaller checklists inside each card at the end to keep me focused on building the features that I need to:</w:t>
+      </w:r>
+    </w:p>
+    <w:p>
+      <w:pPr>
+        <w:rPr>
+          <w:noProof/>
+        </w:rPr>
+      </w:pPr>
+      <w:r>
+        <w:rPr>
+          <w:noProof/>
+        </w:rPr>
+        <w:drawing>
+          <wp:anchor distT="0" distB="0" distL="114300" distR="114300" simplePos="0" relativeHeight="252052480" behindDoc="0" locked="0" layoutInCell="1" allowOverlap="1" wp14:anchorId="17B47F4A" wp14:editId="42642E54">
+            <wp:simplePos x="0" y="0"/>
+            <wp:positionH relativeFrom="margin">
+              <wp:align>left</wp:align>
+            </wp:positionH>
+            <wp:positionV relativeFrom="paragraph">
+              <wp:posOffset>193040</wp:posOffset>
+            </wp:positionV>
+            <wp:extent cx="4676775" cy="2168525"/>
+            <wp:effectExtent l="0" t="0" r="9525" b="3175"/>
+            <wp:wrapSquare wrapText="bothSides"/>
+            <wp:docPr id="1378741348" name="Picture 1"/>
+            <wp:cNvGraphicFramePr>
+              <a:graphicFrameLocks xmlns:a="http://schemas.openxmlformats.org/drawingml/2006/main" noChangeAspect="1"/>
+            </wp:cNvGraphicFramePr>
+            <a:graphic xmlns:a="http://schemas.openxmlformats.org/drawingml/2006/main">
+              <a:graphicData uri="http://schemas.openxmlformats.org/drawingml/2006/picture">
+                <pic:pic xmlns:pic="http://schemas.openxmlformats.org/drawingml/2006/picture">
+                  <pic:nvPicPr>
+                    <pic:cNvPr id="1378741348" name=""/>
+                    <pic:cNvPicPr/>
+                  </pic:nvPicPr>
+                  <pic:blipFill>
+                    <a:blip r:embed="rId21"/>
+                    <a:stretch>
+                      <a:fillRect/>
+                    </a:stretch>
+                  </pic:blipFill>
+                  <pic:spPr>
+                    <a:xfrm>
+                      <a:off x="0" y="0"/>
+                      <a:ext cx="4676775" cy="2168525"/>
+                    </a:xfrm>
+                    <a:prstGeom prst="rect">
+                      <a:avLst/>
+                    </a:prstGeom>
+                  </pic:spPr>
+                </pic:pic>
+              </a:graphicData>
+            </a:graphic>
+            <wp14:sizeRelH relativeFrom="margin">
+              <wp14:pctWidth>0</wp14:pctWidth>
+            </wp14:sizeRelH>
+            <wp14:sizeRelV relativeFrom="margin">
+              <wp14:pctHeight>0</wp14:pctHeight>
+            </wp14:sizeRelV>
+          </wp:anchor>
+        </w:drawing>
+      </w:r>
+    </w:p>
+    <w:p>
+      <w:pPr>
+        <w:rPr>
+          <w:noProof/>
+        </w:rPr>
+      </w:pPr>
+    </w:p>
+    <w:p>
+      <w:pPr>
+        <w:rPr>
+          <w:noProof/>
+        </w:rPr>
+      </w:pPr>
+    </w:p>
+    <w:p>
+      <w:pPr>
+        <w:rPr>
+          <w:noProof/>
+        </w:rPr>
+      </w:pPr>
+    </w:p>
+    <w:p>
+      <w:pPr>
+        <w:rPr>
+          <w:noProof/>
+        </w:rPr>
+      </w:pPr>
+    </w:p>
+    <w:p>
+      <w:pPr>
+        <w:rPr>
+          <w:noProof/>
+        </w:rPr>
+      </w:pPr>
+    </w:p>
+    <w:p>
+      <w:pPr>
+        <w:rPr>
+          <w:noProof/>
+        </w:rPr>
+      </w:pPr>
     </w:p>
     <w:p>
       <w:pPr>
@@ -1694,7 +2107,7 @@
       <w:r>
         <w:t xml:space="preserve">GITHUB repository: </w:t>
       </w:r>
-      <w:hyperlink r:id="rId17" w:history="1">
+      <w:hyperlink r:id="rId22" w:history="1">
         <w:r>
           <w:rPr>
             <w:rStyle w:val="Hyperlink"/>
@@ -1735,7 +2148,7 @@
                     <pic:cNvPicPr/>
                   </pic:nvPicPr>
                   <pic:blipFill>
-                    <a:blip r:embed="rId18"/>
+                    <a:blip r:embed="rId23"/>
                     <a:stretch>
                       <a:fillRect/>
                     </a:stretch>
@@ -1789,7 +2202,7 @@
                     <pic:cNvPicPr/>
                   </pic:nvPicPr>
                   <pic:blipFill>
-                    <a:blip r:embed="rId19"/>
+                    <a:blip r:embed="rId24"/>
                     <a:stretch>
                       <a:fillRect/>
                     </a:stretch>
@@ -2229,7 +2642,7 @@
                           <pic:cNvPicPr/>
                         </pic:nvPicPr>
                         <pic:blipFill>
-                          <a:blip r:embed="rId20"/>
+                          <a:blip r:embed="rId25"/>
                           <a:stretch>
                             <a:fillRect/>
                           </a:stretch>
@@ -2298,7 +2711,7 @@
                           <pic:cNvPicPr/>
                         </pic:nvPicPr>
                         <pic:blipFill>
-                          <a:blip r:embed="rId21"/>
+                          <a:blip r:embed="rId26"/>
                           <a:stretch>
                             <a:fillRect/>
                           </a:stretch>
@@ -2365,7 +2778,21 @@
               <w:rPr>
                 <w:highlight w:val="yellow"/>
               </w:rPr>
-              <w:t xml:space="preserve">. I planned two fonts: urbanist and sensation, two color palettes a pink and a white one, </w:t>
+              <w:t xml:space="preserve">. I planned two </w:t>
+            </w:r>
+            <w:proofErr w:type="spellStart"/>
+            <w:r>
+              <w:rPr>
+                <w:highlight w:val="yellow"/>
+              </w:rPr>
+              <w:t>fonts</w:t>
+            </w:r>
+            <w:proofErr w:type="spellEnd"/>
+            <w:r>
+              <w:rPr>
+                <w:highlight w:val="yellow"/>
+              </w:rPr>
+              <w:t xml:space="preserve">: urbanist and sensation, two color palettes a pink and a white one, </w:t>
             </w:r>
             <w:r>
               <w:rPr>
@@ -2418,6 +2845,7 @@
                 <w:highlight w:val="yellow"/>
                 <w:lang w:val="en-NZ"/>
               </w:rPr>
+              <w:lastRenderedPageBreak/>
               <w:t>I didn’t get to finalise the MVP feature list. I was mainly building it as I went, trying to make it as good as possible within the time restriction of this sprint. I also didn’t complete a detailed user journey, which I should have done because it is important for planning how the user will interact with my interface.</w:t>
             </w:r>
           </w:p>
@@ -2475,7 +2903,6 @@
               <w:rPr>
                 <w:highlight w:val="yellow"/>
               </w:rPr>
-              <w:lastRenderedPageBreak/>
               <w:t>I learnt that I like the combination of urbanist and the white color palette best, due to its high contrast ratio and mature appearance.</w:t>
             </w:r>
           </w:p>
@@ -2655,7 +3082,7 @@
                           <pic:cNvPicPr/>
                         </pic:nvPicPr>
                         <pic:blipFill>
-                          <a:blip r:embed="rId22"/>
+                          <a:blip r:embed="rId27"/>
                           <a:stretch>
                             <a:fillRect/>
                           </a:stretch>
@@ -2819,7 +3246,7 @@
                           <pic:cNvPicPr/>
                         </pic:nvPicPr>
                         <pic:blipFill>
-                          <a:blip r:embed="rId23"/>
+                          <a:blip r:embed="rId28"/>
                           <a:stretch>
                             <a:fillRect/>
                           </a:stretch>
@@ -2882,7 +3309,7 @@
                           <pic:cNvPicPr/>
                         </pic:nvPicPr>
                         <pic:blipFill>
-                          <a:blip r:embed="rId24"/>
+                          <a:blip r:embed="rId29"/>
                           <a:stretch>
                             <a:fillRect/>
                           </a:stretch>
@@ -2935,7 +3362,35 @@
               <w:rPr>
                 <w:highlight w:val="yellow"/>
               </w:rPr>
-              <w:t xml:space="preserve">I built an initial interface, having a small version to show users for early stage testing. It had the most likely combination of fonts and colours that I picked, and it had a button element from Uiverse to make it look visually appealing. I added the ability to </w:t>
+              <w:t xml:space="preserve">I built an initial interface, having a small version to show users for early stage testing. It had the most likely combination of fonts and </w:t>
+            </w:r>
+            <w:proofErr w:type="spellStart"/>
+            <w:r>
+              <w:rPr>
+                <w:highlight w:val="yellow"/>
+              </w:rPr>
+              <w:t>colours</w:t>
+            </w:r>
+            <w:proofErr w:type="spellEnd"/>
+            <w:r>
+              <w:rPr>
+                <w:highlight w:val="yellow"/>
+              </w:rPr>
+              <w:t xml:space="preserve"> that I picked, and it had a button element from </w:t>
+            </w:r>
+            <w:proofErr w:type="spellStart"/>
+            <w:r>
+              <w:rPr>
+                <w:highlight w:val="yellow"/>
+              </w:rPr>
+              <w:t>Uiverse</w:t>
+            </w:r>
+            <w:proofErr w:type="spellEnd"/>
+            <w:r>
+              <w:rPr>
+                <w:highlight w:val="yellow"/>
+              </w:rPr>
+              <w:t xml:space="preserve"> to make it look visually appealing. I added the ability to </w:t>
             </w:r>
             <w:r>
               <w:rPr>
@@ -2992,6 +3447,7 @@
               <w:rPr>
                 <w:highlight w:val="yellow"/>
               </w:rPr>
+              <w:lastRenderedPageBreak/>
               <w:t>I missed the objective of adding basic widget functionality, however I completed this a day after the phase was finished on the 11</w:t>
             </w:r>
             <w:r>
@@ -3400,8 +3856,16 @@
               <w:rPr>
                 <w:highlight w:val="yellow"/>
               </w:rPr>
-              <w:t xml:space="preserve"> Relfection</w:t>
-            </w:r>
+              <w:t xml:space="preserve"> </w:t>
+            </w:r>
+            <w:proofErr w:type="spellStart"/>
+            <w:r>
+              <w:rPr>
+                <w:highlight w:val="yellow"/>
+              </w:rPr>
+              <w:t>Relfection</w:t>
+            </w:r>
+            <w:proofErr w:type="spellEnd"/>
           </w:p>
         </w:tc>
         <w:tc>
@@ -3445,7 +3909,7 @@
                           <pic:cNvPicPr/>
                         </pic:nvPicPr>
                         <pic:blipFill>
-                          <a:blip r:embed="rId25"/>
+                          <a:blip r:embed="rId30"/>
                           <a:stretch>
                             <a:fillRect/>
                           </a:stretch>
@@ -3514,7 +3978,7 @@
                           <pic:cNvPicPr/>
                         </pic:nvPicPr>
                         <pic:blipFill>
-                          <a:blip r:embed="rId26"/>
+                          <a:blip r:embed="rId31"/>
                           <a:stretch>
                             <a:fillRect/>
                           </a:stretch>
@@ -3636,6 +4100,7 @@
               <w:rPr>
                 <w:highlight w:val="yellow"/>
               </w:rPr>
+              <w:lastRenderedPageBreak/>
               <w:t>I decided to mo</w:t>
             </w:r>
             <w:r>
@@ -3711,7 +4176,6 @@
               <w:rPr>
                 <w:highlight w:val="yellow"/>
               </w:rPr>
-              <w:lastRenderedPageBreak/>
               <w:t>I will move on to late stage testing, debugging, code validation  keeping in mind that I need to revalidate all major changes made to the interface during the early stage feedback process.</w:t>
             </w:r>
           </w:p>
@@ -3949,6 +4413,7 @@
               <w:rPr>
                 <w:highlight w:val="yellow"/>
               </w:rPr>
+              <w:lastRenderedPageBreak/>
               <w:t>19/09/26</w:t>
             </w:r>
           </w:p>
@@ -4011,7 +4476,7 @@
                           <pic:cNvPicPr/>
                         </pic:nvPicPr>
                         <pic:blipFill>
-                          <a:blip r:embed="rId27"/>
+                          <a:blip r:embed="rId32"/>
                           <a:stretch>
                             <a:fillRect/>
                           </a:stretch>
@@ -4079,7 +4544,7 @@
                           <pic:cNvPicPr/>
                         </pic:nvPicPr>
                         <pic:blipFill>
-                          <a:blip r:embed="rId28"/>
+                          <a:blip r:embed="rId33"/>
                           <a:stretch>
                             <a:fillRect/>
                           </a:stretch>
@@ -4198,7 +4663,6 @@
               <w:rPr>
                 <w:highlight w:val="yellow"/>
               </w:rPr>
-              <w:lastRenderedPageBreak/>
               <w:t xml:space="preserve">I decided to put all the code back through the validator again right at the end of my process to ensure my fixes stayed. </w:t>
             </w:r>
             <w:r>
@@ -4322,7 +4786,6 @@
                 <w:sz w:val="24"/>
                 <w:szCs w:val="24"/>
               </w:rPr>
-              <w:lastRenderedPageBreak/>
               <w:t>1/09/26 – 19/09/26</w:t>
             </w:r>
           </w:p>
@@ -4412,7 +4875,15 @@
                 <w:sz w:val="24"/>
                 <w:szCs w:val="24"/>
               </w:rPr>
-              <w:t>Get feedback from users in realistic conditions and use their feedback to identify and improve and remaining issues before the outcome is complete</w:t>
+              <w:t xml:space="preserve">Get feedback from users in realistic conditions and use their feedback to identify and improve and remaining issues before the </w:t>
+            </w:r>
+            <w:r>
+              <w:rPr>
+                <w:sz w:val="24"/>
+                <w:szCs w:val="24"/>
+              </w:rPr>
+              <w:lastRenderedPageBreak/>
+              <w:t>outcome is complete</w:t>
             </w:r>
           </w:p>
         </w:tc>
@@ -4434,6 +4905,7 @@
                 <w:sz w:val="24"/>
                 <w:szCs w:val="24"/>
               </w:rPr>
+              <w:lastRenderedPageBreak/>
               <w:t>Got a couple of late stage feedback tests from Nikhil around accessibility</w:t>
             </w:r>
             <w:r>
@@ -4527,6 +4999,7 @@
               <w:rPr>
                 <w:highlight w:val="yellow"/>
               </w:rPr>
+              <w:lastRenderedPageBreak/>
               <w:t>20/09/26</w:t>
             </w:r>
           </w:p>
@@ -4592,7 +5065,7 @@
                           <pic:cNvPicPr/>
                         </pic:nvPicPr>
                         <pic:blipFill>
-                          <a:blip r:embed="rId29"/>
+                          <a:blip r:embed="rId34"/>
                           <a:stretch>
                             <a:fillRect/>
                           </a:stretch>
@@ -4661,7 +5134,7 @@
                           <pic:cNvPicPr/>
                         </pic:nvPicPr>
                         <pic:blipFill>
-                          <a:blip r:embed="rId30"/>
+                          <a:blip r:embed="rId35"/>
                           <a:stretch>
                             <a:fillRect/>
                           </a:stretch>
@@ -4798,7 +5271,6 @@
               <w:rPr>
                 <w:highlight w:val="yellow"/>
               </w:rPr>
-              <w:lastRenderedPageBreak/>
               <w:t xml:space="preserve">One of my objectives in the Trello for this phase was to go back and retest the changes made after his feedback, which I haven’t got to do. </w:t>
             </w:r>
           </w:p>
@@ -4959,6 +5431,7 @@
           <w:noProof/>
           <w:color w:val="1A3A5C"/>
         </w:rPr>
+        <w:lastRenderedPageBreak/>
         <w:drawing>
           <wp:anchor distT="0" distB="0" distL="114300" distR="114300" simplePos="0" relativeHeight="251966464" behindDoc="0" locked="0" layoutInCell="1" allowOverlap="1" wp14:anchorId="273A870B" wp14:editId="7AD65FE1">
             <wp:simplePos x="0" y="0"/>
@@ -4983,7 +5456,7 @@
                     <pic:cNvPicPr/>
                   </pic:nvPicPr>
                   <pic:blipFill>
-                    <a:blip r:embed="rId31"/>
+                    <a:blip r:embed="rId36"/>
                     <a:stretch>
                       <a:fillRect/>
                     </a:stretch>
@@ -5041,7 +5514,7 @@
                     <pic:cNvPicPr/>
                   </pic:nvPicPr>
                   <pic:blipFill>
-                    <a:blip r:embed="rId32"/>
+                    <a:blip r:embed="rId37"/>
                     <a:stretch>
                       <a:fillRect/>
                     </a:stretch>
@@ -5097,7 +5570,6 @@
         <w:rPr>
           <w:highlight w:val="yellow"/>
         </w:rPr>
-        <w:lastRenderedPageBreak/>
         <w:t>MVP Plan</w:t>
       </w:r>
       <w:r>
@@ -5248,7 +5720,7 @@
                     </pic:cNvPicPr>
                   </pic:nvPicPr>
                   <pic:blipFill>
-                    <a:blip r:embed="rId33">
+                    <a:blip r:embed="rId38">
                       <a:extLst>
                         <a:ext uri="{28A0092B-C50C-407E-A947-70E740481C1C}">
                           <a14:useLocalDpi xmlns:a14="http://schemas.microsoft.com/office/drawing/2010/main" val="0"/>
@@ -5324,8 +5796,13 @@
       </w:r>
     </w:p>
     <w:p>
+      <w:proofErr w:type="spellStart"/>
       <w:r>
-        <w:t>Color = days until next review</w:t>
+        <w:t>Color</w:t>
+      </w:r>
+      <w:proofErr w:type="spellEnd"/>
+      <w:r>
+        <w:t xml:space="preserve"> = days until next review</w:t>
       </w:r>
     </w:p>
     <w:p>
@@ -5350,6 +5827,7 @@
         <w:rPr>
           <w:noProof/>
         </w:rPr>
+        <w:lastRenderedPageBreak/>
         <w:drawing>
           <wp:anchor distT="0" distB="0" distL="114300" distR="114300" simplePos="0" relativeHeight="251969536" behindDoc="0" locked="0" layoutInCell="1" allowOverlap="1" wp14:anchorId="16FF3C30" wp14:editId="559F6779">
             <wp:simplePos x="0" y="0"/>
@@ -5374,7 +5852,7 @@
                     <pic:cNvPicPr/>
                   </pic:nvPicPr>
                   <pic:blipFill>
-                    <a:blip r:embed="rId34" cstate="print">
+                    <a:blip r:embed="rId39" cstate="print">
                       <a:extLst>
                         <a:ext uri="{28A0092B-C50C-407E-A947-70E740481C1C}">
                           <a14:useLocalDpi xmlns:a14="http://schemas.microsoft.com/office/drawing/2010/main" val="0"/>
@@ -5434,7 +5912,7 @@
                     <pic:cNvPicPr/>
                   </pic:nvPicPr>
                   <pic:blipFill>
-                    <a:blip r:embed="rId35" cstate="print">
+                    <a:blip r:embed="rId40" cstate="print">
                       <a:extLst>
                         <a:ext uri="{28A0092B-C50C-407E-A947-70E740481C1C}">
                           <a14:useLocalDpi xmlns:a14="http://schemas.microsoft.com/office/drawing/2010/main" val="0"/>
@@ -5482,12 +5960,20 @@
       </w:r>
     </w:p>
     <w:p>
-      <w:hyperlink r:id="rId36" w:history="1">
+      <w:hyperlink r:id="rId41" w:history="1">
+        <w:proofErr w:type="spellStart"/>
         <w:r>
           <w:rPr>
             <w:rStyle w:val="Hyperlink"/>
           </w:rPr>
-          <w:t>Color Palette Generator From Image | Adobe Express</w:t>
+          <w:t>Color</w:t>
+        </w:r>
+        <w:proofErr w:type="spellEnd"/>
+        <w:r>
+          <w:rPr>
+            <w:rStyle w:val="Hyperlink"/>
+          </w:rPr>
+          <w:t xml:space="preserve"> Palette Generator From Image | Adobe Express</w:t>
         </w:r>
         <w:r>
           <w:rPr>
@@ -5499,7 +5985,7 @@
       </w:hyperlink>
     </w:p>
     <w:p>
-      <w:hyperlink r:id="rId37" w:history="1">
+      <w:hyperlink r:id="rId42" w:history="1">
         <w:r>
           <w:rPr>
             <w:rStyle w:val="Hyperlink"/>
@@ -5514,13 +6000,21 @@
           <w:noProof/>
         </w:rPr>
       </w:pPr>
-      <w:hyperlink r:id="rId38" w:history="1">
+      <w:hyperlink r:id="rId43" w:history="1">
         <w:r>
           <w:rPr>
             <w:rStyle w:val="Hyperlink"/>
           </w:rPr>
-          <w:t>Create a Palette - Coolors</w:t>
+          <w:t xml:space="preserve">Create a Palette - </w:t>
         </w:r>
+        <w:proofErr w:type="spellStart"/>
+        <w:r>
+          <w:rPr>
+            <w:rStyle w:val="Hyperlink"/>
+          </w:rPr>
+          <w:t>Coolors</w:t>
+        </w:r>
+        <w:proofErr w:type="spellEnd"/>
       </w:hyperlink>
       <w:r>
         <w:rPr>
@@ -5667,7 +6161,21 @@
               <w:rPr>
                 <w:sz w:val="20"/>
               </w:rPr>
-              <w:t>:root tokens for colour, space, type</w:t>
+              <w:t xml:space="preserve">:root tokens for </w:t>
+            </w:r>
+            <w:proofErr w:type="spellStart"/>
+            <w:r>
+              <w:rPr>
+                <w:sz w:val="20"/>
+              </w:rPr>
+              <w:t>colour</w:t>
+            </w:r>
+            <w:proofErr w:type="spellEnd"/>
+            <w:r>
+              <w:rPr>
+                <w:sz w:val="20"/>
+              </w:rPr>
+              <w:t>, space, type</w:t>
             </w:r>
           </w:p>
           <w:p>
@@ -5791,6 +6299,7 @@
               <w:rPr>
                 <w:noProof/>
               </w:rPr>
+              <w:lastRenderedPageBreak/>
               <w:drawing>
                 <wp:anchor distT="0" distB="0" distL="114300" distR="114300" simplePos="0" relativeHeight="251958272" behindDoc="0" locked="0" layoutInCell="1" allowOverlap="1" wp14:anchorId="63561203" wp14:editId="19445635">
                   <wp:simplePos x="0" y="0"/>
@@ -5815,7 +6324,7 @@
                           <pic:cNvPicPr/>
                         </pic:nvPicPr>
                         <pic:blipFill>
-                          <a:blip r:embed="rId39"/>
+                          <a:blip r:embed="rId44"/>
                           <a:stretch>
                             <a:fillRect/>
                           </a:stretch>
@@ -5896,7 +6405,7 @@
                           <pic:cNvPicPr/>
                         </pic:nvPicPr>
                         <pic:blipFill>
-                          <a:blip r:embed="rId40"/>
+                          <a:blip r:embed="rId45"/>
                           <a:stretch>
                             <a:fillRect/>
                           </a:stretch>
@@ -5951,7 +6460,6 @@
               <w:spacing w:before="40" w:after="40"/>
             </w:pPr>
             <w:r>
-              <w:lastRenderedPageBreak/>
               <w:drawing>
                 <wp:anchor distT="0" distB="0" distL="114300" distR="114300" simplePos="0" relativeHeight="252036096" behindDoc="0" locked="0" layoutInCell="1" allowOverlap="1" wp14:anchorId="0E2D90D9" wp14:editId="67319E2E">
                   <wp:simplePos x="0" y="0"/>
@@ -5976,7 +6484,7 @@
                           <pic:cNvPicPr/>
                         </pic:nvPicPr>
                         <pic:blipFill>
-                          <a:blip r:embed="rId41"/>
+                          <a:blip r:embed="rId46"/>
                           <a:stretch>
                             <a:fillRect/>
                           </a:stretch>
@@ -6027,7 +6535,7 @@
                           <pic:cNvPicPr/>
                         </pic:nvPicPr>
                         <pic:blipFill>
-                          <a:blip r:embed="rId42"/>
+                          <a:blip r:embed="rId47"/>
                           <a:stretch>
                             <a:fillRect/>
                           </a:stretch>
@@ -6202,6 +6710,7 @@
               <w:rPr>
                 <w:lang w:val="en-NZ"/>
               </w:rPr>
+              <w:lastRenderedPageBreak/>
               <w:t>Flex-direction: column</w:t>
             </w:r>
             <w:r>
@@ -6287,7 +6796,7 @@
                           <pic:cNvPicPr/>
                         </pic:nvPicPr>
                         <pic:blipFill>
-                          <a:blip r:embed="rId43"/>
+                          <a:blip r:embed="rId48"/>
                           <a:stretch>
                             <a:fillRect/>
                           </a:stretch>
@@ -6354,7 +6863,7 @@
                           <pic:cNvPicPr/>
                         </pic:nvPicPr>
                         <pic:blipFill>
-                          <a:blip r:embed="rId44"/>
+                          <a:blip r:embed="rId49"/>
                           <a:stretch>
                             <a:fillRect/>
                           </a:stretch>
@@ -6520,11 +7029,19 @@
                 <w:lang w:val="en-NZ"/>
               </w:rPr>
             </w:pPr>
+            <w:proofErr w:type="spellStart"/>
             <w:r>
               <w:rPr>
                 <w:lang w:val="en-NZ"/>
               </w:rPr>
-              <w:t>localStorage.setItem(</w:t>
+              <w:t>localStorage.setItem</w:t>
+            </w:r>
+            <w:proofErr w:type="spellEnd"/>
+            <w:r>
+              <w:rPr>
+                <w:lang w:val="en-NZ"/>
+              </w:rPr>
+              <w:t>(</w:t>
             </w:r>
           </w:p>
           <w:p>
@@ -6552,7 +7069,21 @@
               <w:rPr>
                 <w:lang w:val="en-NZ"/>
               </w:rPr>
-              <w:t xml:space="preserve">    JSON.stringify(theses)</w:t>
+              <w:t xml:space="preserve">    </w:t>
+            </w:r>
+            <w:proofErr w:type="spellStart"/>
+            <w:r>
+              <w:rPr>
+                <w:lang w:val="en-NZ"/>
+              </w:rPr>
+              <w:t>JSON.stringify</w:t>
+            </w:r>
+            <w:proofErr w:type="spellEnd"/>
+            <w:r>
+              <w:rPr>
+                <w:lang w:val="en-NZ"/>
+              </w:rPr>
+              <w:t>(theses)</w:t>
             </w:r>
           </w:p>
           <w:p>
@@ -6578,8 +7109,21 @@
             <w:pPr>
               <w:spacing w:before="40" w:after="40"/>
             </w:pPr>
-            <w:r>
-              <w:t>JSON.stringify() converts the javascript array of thesis objects into a JSON string before saving it</w:t>
+            <w:proofErr w:type="spellStart"/>
+            <w:r>
+              <w:t>JSON.stringify</w:t>
+            </w:r>
+            <w:proofErr w:type="spellEnd"/>
+            <w:r>
+              <w:t xml:space="preserve">() converts the </w:t>
+            </w:r>
+            <w:proofErr w:type="spellStart"/>
+            <w:r>
+              <w:t>javascript</w:t>
+            </w:r>
+            <w:proofErr w:type="spellEnd"/>
+            <w:r>
+              <w:t xml:space="preserve"> array of thesis objects into a JSON string before saving it</w:t>
             </w:r>
           </w:p>
           <w:p>
@@ -6611,6 +7155,7 @@
               <w:rPr>
                 <w:noProof/>
               </w:rPr>
+              <w:lastRenderedPageBreak/>
               <w:drawing>
                 <wp:anchor distT="0" distB="0" distL="114300" distR="114300" simplePos="0" relativeHeight="252042240" behindDoc="0" locked="0" layoutInCell="1" allowOverlap="1" wp14:anchorId="0716A5F5" wp14:editId="5F8AE94E">
                   <wp:simplePos x="0" y="0"/>
@@ -6635,7 +7180,7 @@
                           <pic:cNvPicPr/>
                         </pic:nvPicPr>
                         <pic:blipFill>
-                          <a:blip r:embed="rId45"/>
+                          <a:blip r:embed="rId50"/>
                           <a:stretch>
                             <a:fillRect/>
                           </a:stretch>
@@ -6675,7 +7220,15 @@
               <w:spacing w:before="40" w:after="40"/>
             </w:pPr>
             <w:r>
-              <w:t xml:space="preserve">Json and localstorage to save users thesis parts. The data will be accessible in the users ‘saved theses’ box on the home page of the dashboard. </w:t>
+              <w:t xml:space="preserve">Json and </w:t>
+            </w:r>
+            <w:proofErr w:type="spellStart"/>
+            <w:r>
+              <w:t>localstorage</w:t>
+            </w:r>
+            <w:proofErr w:type="spellEnd"/>
+            <w:r>
+              <w:t xml:space="preserve"> to save users thesis parts. The data will be accessible in the users ‘saved theses’ box on the home page of the dashboard. </w:t>
             </w:r>
             <w:r>
               <w:br/>
@@ -6713,7 +7266,6 @@
               <w:spacing w:before="40" w:after="40"/>
             </w:pPr>
             <w:r>
-              <w:lastRenderedPageBreak/>
               <w:drawing>
                 <wp:anchor distT="0" distB="0" distL="114300" distR="114300" simplePos="0" relativeHeight="252044288" behindDoc="0" locked="0" layoutInCell="1" allowOverlap="1" wp14:anchorId="7D924643" wp14:editId="640C4539">
                   <wp:simplePos x="0" y="0"/>
@@ -6738,7 +7290,7 @@
                           <pic:cNvPicPr/>
                         </pic:nvPicPr>
                         <pic:blipFill>
-                          <a:blip r:embed="rId46"/>
+                          <a:blip r:embed="rId51"/>
                           <a:stretch>
                             <a:fillRect/>
                           </a:stretch>
@@ -6787,6 +7339,9 @@
           <w:p>
             <w:pPr>
               <w:spacing w:before="40" w:after="40"/>
+              <w:rPr>
+                <w:lang w:val="en-NZ"/>
+              </w:rPr>
             </w:pPr>
             <w:r>
               <w:t>Image of retrieval function code.</w:t>
@@ -6821,7 +7376,7 @@
                           <pic:cNvPicPr/>
                         </pic:nvPicPr>
                         <pic:blipFill>
-                          <a:blip r:embed="rId47"/>
+                          <a:blip r:embed="rId52"/>
                           <a:stretch>
                             <a:fillRect/>
                           </a:stretch>
@@ -6969,8 +7524,16 @@
               <w:rPr>
                 <w:sz w:val="20"/>
               </w:rPr>
-              <w:t>Asset pipeline / optimisation</w:t>
-            </w:r>
+              <w:t xml:space="preserve">Asset pipeline / </w:t>
+            </w:r>
+            <w:proofErr w:type="spellStart"/>
+            <w:r>
+              <w:rPr>
+                <w:sz w:val="20"/>
+              </w:rPr>
+              <w:t>optimisation</w:t>
+            </w:r>
+            <w:proofErr w:type="spellEnd"/>
           </w:p>
         </w:tc>
         <w:tc>
@@ -7063,6 +7626,7 @@
       <w:bookmarkStart w:id="10" w:name="_Relevant_Implications"/>
       <w:bookmarkEnd w:id="10"/>
       <w:r>
+        <w:lastRenderedPageBreak/>
         <w:t xml:space="preserve">Relevant </w:t>
       </w:r>
       <w:r>
@@ -7242,16 +7806,7 @@
                 <w:sz w:val="24"/>
                 <w:szCs w:val="24"/>
               </w:rPr>
-              <w:t xml:space="preserve">Most users will have different visual and other accessibility needs, ensuring </w:t>
-            </w:r>
-            <w:r>
-              <w:rPr>
-                <w:b/>
-                <w:sz w:val="24"/>
-                <w:szCs w:val="24"/>
-              </w:rPr>
-              <w:lastRenderedPageBreak/>
-              <w:t>the interface provides options that make</w:t>
+              <w:t>Most users will have different visual and other accessibility needs, ensuring the interface provides options that make</w:t>
             </w:r>
             <w:r>
               <w:rPr>
@@ -7314,16 +7869,16 @@
                 <w:color w:val="171717" w:themeColor="background2" w:themeShade="1A"/>
               </w:rPr>
               <w:drawing>
-                <wp:anchor distT="0" distB="0" distL="114300" distR="114300" simplePos="0" relativeHeight="251954176" behindDoc="0" locked="0" layoutInCell="1" allowOverlap="1" wp14:anchorId="45035AFD" wp14:editId="1BA1F3C1">
+                <wp:anchor distT="0" distB="0" distL="114300" distR="114300" simplePos="0" relativeHeight="251954176" behindDoc="0" locked="0" layoutInCell="1" allowOverlap="1" wp14:anchorId="45035AFD" wp14:editId="73AE7776">
                   <wp:simplePos x="0" y="0"/>
                   <wp:positionH relativeFrom="column">
-                    <wp:posOffset>-64770</wp:posOffset>
+                    <wp:posOffset>-65405</wp:posOffset>
                   </wp:positionH>
                   <wp:positionV relativeFrom="paragraph">
-                    <wp:posOffset>793750</wp:posOffset>
+                    <wp:posOffset>794385</wp:posOffset>
                   </wp:positionV>
-                  <wp:extent cx="1080770" cy="95885"/>
-                  <wp:effectExtent l="0" t="0" r="5080" b="0"/>
+                  <wp:extent cx="1601470" cy="141605"/>
+                  <wp:effectExtent l="0" t="0" r="0" b="0"/>
                   <wp:wrapSquare wrapText="bothSides"/>
                   <wp:docPr id="1254537311" name="Picture 1"/>
                   <wp:cNvGraphicFramePr>
@@ -7337,7 +7892,7 @@
                           <pic:cNvPicPr/>
                         </pic:nvPicPr>
                         <pic:blipFill>
-                          <a:blip r:embed="rId48"/>
+                          <a:blip r:embed="rId53"/>
                           <a:stretch>
                             <a:fillRect/>
                           </a:stretch>
@@ -7345,7 +7900,7 @@
                         <pic:spPr>
                           <a:xfrm>
                             <a:off x="0" y="0"/>
-                            <a:ext cx="1080770" cy="95885"/>
+                            <a:ext cx="1601470" cy="141605"/>
                           </a:xfrm>
                           <a:prstGeom prst="rect">
                             <a:avLst/>
@@ -7391,6 +7946,45 @@
               <w:t xml:space="preserve"> resizer from Nikhil:</w:t>
             </w:r>
           </w:p>
+          <w:p>
+            <w:pPr>
+              <w:rPr>
+                <w:b/>
+                <w:color w:val="171717" w:themeColor="background2" w:themeShade="1A"/>
+                <w:sz w:val="24"/>
+                <w:szCs w:val="24"/>
+              </w:rPr>
+            </w:pPr>
+          </w:p>
+          <w:p>
+            <w:pPr>
+              <w:rPr>
+                <w:b/>
+                <w:color w:val="171717" w:themeColor="background2" w:themeShade="1A"/>
+                <w:sz w:val="24"/>
+                <w:szCs w:val="24"/>
+              </w:rPr>
+            </w:pPr>
+          </w:p>
+          <w:p>
+            <w:pPr>
+              <w:rPr>
+                <w:b/>
+                <w:color w:val="171717" w:themeColor="background2" w:themeShade="1A"/>
+                <w:sz w:val="24"/>
+                <w:szCs w:val="24"/>
+              </w:rPr>
+            </w:pPr>
+            <w:r>
+              <w:rPr>
+                <w:b/>
+                <w:color w:val="171717" w:themeColor="background2" w:themeShade="1A"/>
+                <w:sz w:val="24"/>
+                <w:szCs w:val="24"/>
+              </w:rPr>
+              <w:t>This means the relevant implication of accessibility was thought about early on in my development, during the early stage testing phase.</w:t>
+            </w:r>
+          </w:p>
         </w:tc>
         <w:tc>
           <w:tcPr>
@@ -7414,196 +8008,185 @@
                 <w:szCs w:val="24"/>
                 <w:lang w:val="en-NZ"/>
               </w:rPr>
+              <w:t xml:space="preserve">I addressed this implication through extensive high contrast testing, and the use of global variables to ensure all my colours were the same. </w:t>
+            </w:r>
+          </w:p>
+          <w:p>
+            <w:pPr>
+              <w:rPr>
+                <w:b/>
+                <w:color w:val="171717" w:themeColor="background2" w:themeShade="1A"/>
+                <w:sz w:val="24"/>
+                <w:szCs w:val="24"/>
+                <w:lang w:val="en-NZ"/>
+              </w:rPr>
+            </w:pPr>
+          </w:p>
+          <w:p>
+            <w:pPr>
+              <w:rPr>
+                <w:b/>
+                <w:color w:val="171717" w:themeColor="background2" w:themeShade="1A"/>
+                <w:sz w:val="24"/>
+                <w:szCs w:val="24"/>
+                <w:lang w:val="en-NZ"/>
+              </w:rPr>
+            </w:pPr>
+            <w:r>
+              <w:rPr>
+                <w:b/>
+                <w:color w:val="171717" w:themeColor="background2" w:themeShade="1A"/>
+                <w:sz w:val="24"/>
+                <w:szCs w:val="24"/>
+                <w:lang w:val="en-NZ"/>
+              </w:rPr>
+              <w:t>Specifically in my widgets on the dashboard, I made sure to test that they were high contrast before implementing the colour combination into my final design.</w:t>
+            </w:r>
+            <w:r>
+              <w:rPr>
+                <w:b/>
+                <w:color w:val="171717" w:themeColor="background2" w:themeShade="1A"/>
+                <w:sz w:val="24"/>
+                <w:szCs w:val="24"/>
+                <w:lang w:val="en-NZ"/>
+              </w:rPr>
+              <w:t xml:space="preserve"> This </w:t>
+            </w:r>
+            <w:r>
+              <w:rPr>
+                <w:b/>
+                <w:color w:val="171717" w:themeColor="background2" w:themeShade="1A"/>
+                <w:sz w:val="24"/>
+                <w:szCs w:val="24"/>
+                <w:lang w:val="en-NZ"/>
+              </w:rPr>
+              <w:t xml:space="preserve">shows the implication of accessibility as it makes text, buttons, </w:t>
+            </w:r>
+            <w:r>
+              <w:rPr>
+                <w:b/>
+                <w:color w:val="171717" w:themeColor="background2" w:themeShade="1A"/>
+                <w:sz w:val="24"/>
+                <w:szCs w:val="24"/>
+                <w:lang w:val="en-NZ"/>
+              </w:rPr>
+              <w:t>icons, and other interface elements easier to distinguish from their background. This makes text easier to read, helping users with visual impairments, and reduces visual ambiguity so users don’t have to rely on subtle colour differences to understand the interface.</w:t>
+            </w:r>
+          </w:p>
+          <w:p>
+            <w:pPr>
+              <w:rPr>
+                <w:b/>
+                <w:color w:val="171717" w:themeColor="background2" w:themeShade="1A"/>
+                <w:sz w:val="24"/>
+                <w:szCs w:val="24"/>
+                <w:lang w:val="en-NZ"/>
+              </w:rPr>
+            </w:pPr>
+          </w:p>
+          <w:p>
+            <w:pPr>
+              <w:rPr>
+                <w:b/>
+                <w:color w:val="171717" w:themeColor="background2" w:themeShade="1A"/>
+                <w:sz w:val="24"/>
+                <w:szCs w:val="24"/>
+                <w:lang w:val="en-NZ"/>
+              </w:rPr>
+            </w:pPr>
+          </w:p>
+          <w:p>
+            <w:pPr>
+              <w:rPr>
+                <w:b/>
+                <w:color w:val="171717" w:themeColor="background2" w:themeShade="1A"/>
+                <w:sz w:val="24"/>
+                <w:szCs w:val="24"/>
+                <w:lang w:val="en-NZ"/>
+              </w:rPr>
+            </w:pPr>
+            <w:r>
+              <w:rPr>
+                <w:b/>
+                <w:color w:val="171717" w:themeColor="background2" w:themeShade="1A"/>
+                <w:sz w:val="24"/>
+                <w:szCs w:val="24"/>
+                <w:lang w:val="en-NZ"/>
+              </w:rPr>
+              <w:t xml:space="preserve">I also added </w:t>
+            </w:r>
+            <w:r>
+              <w:rPr>
+                <w:b/>
+                <w:color w:val="171717" w:themeColor="background2" w:themeShade="1A"/>
+                <w:sz w:val="24"/>
+                <w:szCs w:val="24"/>
+                <w:lang w:val="en-NZ"/>
+              </w:rPr>
+              <w:t>appropriate headings to make the interface easier to use with screen readers</w:t>
+            </w:r>
+            <w:r>
+              <w:rPr>
+                <w:b/>
+                <w:color w:val="171717" w:themeColor="background2" w:themeShade="1A"/>
+                <w:sz w:val="24"/>
+                <w:szCs w:val="24"/>
+                <w:lang w:val="en-NZ"/>
+              </w:rPr>
+              <w:t xml:space="preserve">. Using headers like &lt;h1&gt; &lt;h2&gt; </w:t>
+            </w:r>
+            <w:r>
+              <w:rPr>
+                <w:b/>
+                <w:color w:val="171717" w:themeColor="background2" w:themeShade="1A"/>
+                <w:sz w:val="24"/>
+                <w:szCs w:val="24"/>
+                <w:lang w:val="en-NZ"/>
+              </w:rPr>
+              <w:t>creates a hierarchy. Screen readers use headings as navigation landmarks, allowing users to jump around the screen by headings rather than listening to every piece of text.</w:t>
+            </w:r>
+          </w:p>
+          <w:p>
+            <w:pPr>
+              <w:rPr>
+                <w:b/>
+                <w:color w:val="171717" w:themeColor="background2" w:themeShade="1A"/>
+                <w:sz w:val="24"/>
+                <w:szCs w:val="24"/>
+                <w:lang w:val="en-NZ"/>
+              </w:rPr>
+            </w:pPr>
+          </w:p>
+          <w:p>
+            <w:pPr>
+              <w:rPr>
+                <w:b/>
+                <w:color w:val="171717" w:themeColor="background2" w:themeShade="1A"/>
+                <w:sz w:val="24"/>
+                <w:szCs w:val="24"/>
+                <w:lang w:val="en-NZ"/>
+              </w:rPr>
+            </w:pPr>
+          </w:p>
+          <w:p>
+            <w:pPr>
+              <w:rPr>
+                <w:b/>
+                <w:color w:val="171717" w:themeColor="background2" w:themeShade="1A"/>
+                <w:sz w:val="24"/>
+                <w:szCs w:val="24"/>
+                <w:lang w:val="en-NZ"/>
+              </w:rPr>
+            </w:pPr>
+            <w:r>
+              <w:rPr>
+                <w:b/>
+                <w:color w:val="171717" w:themeColor="background2" w:themeShade="1A"/>
+                <w:sz w:val="24"/>
+                <w:szCs w:val="24"/>
+                <w:lang w:val="en-NZ"/>
+              </w:rPr>
               <w:lastRenderedPageBreak/>
-              <w:t xml:space="preserve">I addressed this implication through extensive high contrast testing, and the use of global variables to ensure all my colours were the same. </w:t>
-            </w:r>
-          </w:p>
-          <w:p>
-            <w:pPr>
-              <w:rPr>
-                <w:b/>
-                <w:color w:val="171717" w:themeColor="background2" w:themeShade="1A"/>
-                <w:sz w:val="24"/>
-                <w:szCs w:val="24"/>
-                <w:lang w:val="en-NZ"/>
-              </w:rPr>
-            </w:pPr>
-          </w:p>
-          <w:p>
-            <w:pPr>
-              <w:rPr>
-                <w:b/>
-                <w:color w:val="171717" w:themeColor="background2" w:themeShade="1A"/>
-                <w:sz w:val="24"/>
-                <w:szCs w:val="24"/>
-                <w:lang w:val="en-NZ"/>
-              </w:rPr>
-            </w:pPr>
-            <w:r>
-              <w:rPr>
-                <w:b/>
-                <w:color w:val="171717" w:themeColor="background2" w:themeShade="1A"/>
-                <w:sz w:val="24"/>
-                <w:szCs w:val="24"/>
-                <w:lang w:val="en-NZ"/>
-              </w:rPr>
-              <w:t xml:space="preserve">Specifically in my widgets on the dashboard, I made sure to test that they were high contrast before implementing the colour combination into my </w:t>
-            </w:r>
-            <w:r>
-              <w:rPr>
-                <w:b/>
-                <w:color w:val="171717" w:themeColor="background2" w:themeShade="1A"/>
-                <w:sz w:val="24"/>
-                <w:szCs w:val="24"/>
-                <w:lang w:val="en-NZ"/>
-              </w:rPr>
-              <w:lastRenderedPageBreak/>
-              <w:t>final design.</w:t>
-            </w:r>
-            <w:r>
-              <w:rPr>
-                <w:b/>
-                <w:color w:val="171717" w:themeColor="background2" w:themeShade="1A"/>
-                <w:sz w:val="24"/>
-                <w:szCs w:val="24"/>
-                <w:lang w:val="en-NZ"/>
-              </w:rPr>
-              <w:t xml:space="preserve"> This </w:t>
-            </w:r>
-            <w:r>
-              <w:rPr>
-                <w:b/>
-                <w:color w:val="171717" w:themeColor="background2" w:themeShade="1A"/>
-                <w:sz w:val="24"/>
-                <w:szCs w:val="24"/>
-                <w:lang w:val="en-NZ"/>
-              </w:rPr>
-              <w:t xml:space="preserve">shows the implication of accessibility as it makes text, buttons, </w:t>
-            </w:r>
-            <w:r>
-              <w:rPr>
-                <w:b/>
-                <w:color w:val="171717" w:themeColor="background2" w:themeShade="1A"/>
-                <w:sz w:val="24"/>
-                <w:szCs w:val="24"/>
-                <w:lang w:val="en-NZ"/>
-              </w:rPr>
-              <w:t>icons, and other interface elements easier to distinguish from their background. This makes text easier to read, helping users with visual impairments, and reduces visual ambiguity so users don’t have to rely on subtle colour differences to understand the interface.</w:t>
-            </w:r>
-          </w:p>
-          <w:p>
-            <w:pPr>
-              <w:rPr>
-                <w:b/>
-                <w:color w:val="171717" w:themeColor="background2" w:themeShade="1A"/>
-                <w:sz w:val="24"/>
-                <w:szCs w:val="24"/>
-                <w:lang w:val="en-NZ"/>
-              </w:rPr>
-            </w:pPr>
-          </w:p>
-          <w:p>
-            <w:pPr>
-              <w:rPr>
-                <w:b/>
-                <w:color w:val="171717" w:themeColor="background2" w:themeShade="1A"/>
-                <w:sz w:val="24"/>
-                <w:szCs w:val="24"/>
-                <w:lang w:val="en-NZ"/>
-              </w:rPr>
-            </w:pPr>
-          </w:p>
-          <w:p>
-            <w:pPr>
-              <w:rPr>
-                <w:b/>
-                <w:color w:val="171717" w:themeColor="background2" w:themeShade="1A"/>
-                <w:sz w:val="24"/>
-                <w:szCs w:val="24"/>
-                <w:lang w:val="en-NZ"/>
-              </w:rPr>
-            </w:pPr>
-            <w:r>
-              <w:rPr>
-                <w:b/>
-                <w:color w:val="171717" w:themeColor="background2" w:themeShade="1A"/>
-                <w:sz w:val="24"/>
-                <w:szCs w:val="24"/>
-                <w:lang w:val="en-NZ"/>
-              </w:rPr>
-              <w:t xml:space="preserve">I also added </w:t>
-            </w:r>
-            <w:r>
-              <w:rPr>
-                <w:b/>
-                <w:color w:val="171717" w:themeColor="background2" w:themeShade="1A"/>
-                <w:sz w:val="24"/>
-                <w:szCs w:val="24"/>
-                <w:lang w:val="en-NZ"/>
-              </w:rPr>
-              <w:t>appropriate headings to make the interface easier to use with screen readers</w:t>
-            </w:r>
-            <w:r>
-              <w:rPr>
-                <w:b/>
-                <w:color w:val="171717" w:themeColor="background2" w:themeShade="1A"/>
-                <w:sz w:val="24"/>
-                <w:szCs w:val="24"/>
-                <w:lang w:val="en-NZ"/>
-              </w:rPr>
-              <w:t xml:space="preserve">. Using headers like &lt;h1&gt; &lt;h2&gt; </w:t>
-            </w:r>
-            <w:r>
-              <w:rPr>
-                <w:b/>
-                <w:color w:val="171717" w:themeColor="background2" w:themeShade="1A"/>
-                <w:sz w:val="24"/>
-                <w:szCs w:val="24"/>
-                <w:lang w:val="en-NZ"/>
-              </w:rPr>
-              <w:t>creates a hierarchy. Screen readers use headings as navigation landmarks, allowing users to jump around the screen by headings rather than listening to every piece of text.</w:t>
-            </w:r>
-          </w:p>
-          <w:p>
-            <w:pPr>
-              <w:rPr>
-                <w:b/>
-                <w:color w:val="171717" w:themeColor="background2" w:themeShade="1A"/>
-                <w:sz w:val="24"/>
-                <w:szCs w:val="24"/>
-                <w:lang w:val="en-NZ"/>
-              </w:rPr>
-            </w:pPr>
-          </w:p>
-          <w:p>
-            <w:pPr>
-              <w:rPr>
-                <w:b/>
-                <w:color w:val="171717" w:themeColor="background2" w:themeShade="1A"/>
-                <w:sz w:val="24"/>
-                <w:szCs w:val="24"/>
-                <w:lang w:val="en-NZ"/>
-              </w:rPr>
-            </w:pPr>
-          </w:p>
-          <w:p>
-            <w:pPr>
-              <w:rPr>
-                <w:b/>
-                <w:color w:val="171717" w:themeColor="background2" w:themeShade="1A"/>
-                <w:sz w:val="24"/>
-                <w:szCs w:val="24"/>
-                <w:lang w:val="en-NZ"/>
-              </w:rPr>
-            </w:pPr>
-            <w:r>
-              <w:rPr>
-                <w:b/>
-                <w:color w:val="171717" w:themeColor="background2" w:themeShade="1A"/>
-                <w:sz w:val="24"/>
-                <w:szCs w:val="24"/>
-                <w:lang w:val="en-NZ"/>
-              </w:rPr>
               <w:t>I also added a text resize</w:t>
             </w:r>
             <w:r>
@@ -7768,7 +8351,7 @@
                           <pic:cNvPicPr/>
                         </pic:nvPicPr>
                         <pic:blipFill>
-                          <a:blip r:embed="rId49"/>
+                          <a:blip r:embed="rId54"/>
                           <a:stretch>
                             <a:fillRect/>
                           </a:stretch>
@@ -7864,7 +8447,7 @@
                           <pic:cNvPicPr/>
                         </pic:nvPicPr>
                         <pic:blipFill>
-                          <a:blip r:embed="rId50"/>
+                          <a:blip r:embed="rId55"/>
                           <a:stretch>
                             <a:fillRect/>
                           </a:stretch>
@@ -7983,7 +8566,7 @@
                           <pic:cNvPicPr/>
                         </pic:nvPicPr>
                         <pic:blipFill>
-                          <a:blip r:embed="rId51"/>
+                          <a:blip r:embed="rId56"/>
                           <a:stretch>
                             <a:fillRect/>
                           </a:stretch>
@@ -8157,7 +8740,7 @@
                           <pic:cNvPicPr/>
                         </pic:nvPicPr>
                         <pic:blipFill>
-                          <a:blip r:embed="rId52"/>
+                          <a:blip r:embed="rId57"/>
                           <a:stretch>
                             <a:fillRect/>
                           </a:stretch>
@@ -8213,7 +8796,7 @@
                           <pic:cNvPicPr/>
                         </pic:nvPicPr>
                         <pic:blipFill>
-                          <a:blip r:embed="rId53"/>
+                          <a:blip r:embed="rId58"/>
                           <a:stretch>
                             <a:fillRect/>
                           </a:stretch>
@@ -8273,7 +8856,17 @@
                 <w:sz w:val="24"/>
                 <w:szCs w:val="24"/>
               </w:rPr>
-              <w:t>page/topic and the confidence distribution chart as a major section.</w:t>
+              <w:t xml:space="preserve">page/topic and the confidence distribution chart as </w:t>
+            </w:r>
+            <w:r>
+              <w:rPr>
+                <w:b/>
+                <w:color w:val="171717" w:themeColor="background2" w:themeShade="1A"/>
+                <w:sz w:val="24"/>
+                <w:szCs w:val="24"/>
+              </w:rPr>
+              <w:lastRenderedPageBreak/>
+              <w:t>a major section.</w:t>
             </w:r>
           </w:p>
           <w:p>
@@ -8325,7 +8918,7 @@
                           <pic:cNvPicPr/>
                         </pic:nvPicPr>
                         <pic:blipFill>
-                          <a:blip r:embed="rId54"/>
+                          <a:blip r:embed="rId59"/>
                           <a:stretch>
                             <a:fillRect/>
                           </a:stretch>
@@ -8465,7 +9058,6 @@
                 <w:noProof/>
                 <w:color w:val="171717" w:themeColor="background2" w:themeShade="1A"/>
               </w:rPr>
-              <w:lastRenderedPageBreak/>
               <w:drawing>
                 <wp:anchor distT="0" distB="0" distL="114300" distR="114300" simplePos="0" relativeHeight="252021760" behindDoc="0" locked="0" layoutInCell="1" allowOverlap="1" wp14:anchorId="432A24AF" wp14:editId="4C7B0148">
                   <wp:simplePos x="0" y="0"/>
@@ -8490,7 +9082,7 @@
                           <pic:cNvPicPr/>
                         </pic:nvPicPr>
                         <pic:blipFill>
-                          <a:blip r:embed="rId55"/>
+                          <a:blip r:embed="rId60"/>
                           <a:stretch>
                             <a:fillRect/>
                           </a:stretch>
@@ -8800,7 +9392,17 @@
                 <w:sz w:val="24"/>
                 <w:szCs w:val="24"/>
               </w:rPr>
-              <w:t>t happens to their data, allowing them to make an informed decision about it before entering.</w:t>
+              <w:t xml:space="preserve">t </w:t>
+            </w:r>
+            <w:r>
+              <w:rPr>
+                <w:b/>
+                <w:color w:val="171717" w:themeColor="background2" w:themeShade="1A"/>
+                <w:sz w:val="24"/>
+                <w:szCs w:val="24"/>
+              </w:rPr>
+              <w:lastRenderedPageBreak/>
+              <w:t>happens to their data, allowing them to make an informed decision about it before entering.</w:t>
             </w:r>
           </w:p>
         </w:tc>
@@ -8823,6 +9425,7 @@
                 <w:noProof/>
                 <w:color w:val="171717" w:themeColor="background2" w:themeShade="1A"/>
               </w:rPr>
+              <w:lastRenderedPageBreak/>
               <w:drawing>
                 <wp:anchor distT="0" distB="0" distL="114300" distR="114300" simplePos="0" relativeHeight="252023808" behindDoc="0" locked="0" layoutInCell="1" allowOverlap="1" wp14:anchorId="68E6AD00" wp14:editId="0DF8ABFA">
                   <wp:simplePos x="0" y="0"/>
@@ -8847,7 +9450,7 @@
                           <pic:cNvPicPr/>
                         </pic:nvPicPr>
                         <pic:blipFill>
-                          <a:blip r:embed="rId56"/>
+                          <a:blip r:embed="rId61"/>
                           <a:stretch>
                             <a:fillRect/>
                           </a:stretch>
@@ -8922,7 +9525,6 @@
               <w:rPr>
                 <w:sz w:val="20"/>
               </w:rPr>
-              <w:lastRenderedPageBreak/>
               <w:t>Aesthetics / functionality</w:t>
             </w:r>
           </w:p>
@@ -8970,7 +9572,23 @@
                 <w:b/>
                 <w:color w:val="171717" w:themeColor="background2" w:themeShade="1A"/>
               </w:rPr>
-              <w:t xml:space="preserve">I used css </w:t>
+              <w:t xml:space="preserve">I used </w:t>
+            </w:r>
+            <w:proofErr w:type="spellStart"/>
+            <w:r>
+              <w:rPr>
+                <w:b/>
+                <w:color w:val="171717" w:themeColor="background2" w:themeShade="1A"/>
+              </w:rPr>
+              <w:t>css</w:t>
+            </w:r>
+            <w:proofErr w:type="spellEnd"/>
+            <w:r>
+              <w:rPr>
+                <w:b/>
+                <w:color w:val="171717" w:themeColor="background2" w:themeShade="1A"/>
+              </w:rPr>
+              <w:t xml:space="preserve"> </w:t>
             </w:r>
             <w:r>
               <w:rPr>
@@ -9168,7 +9786,7 @@
                           <pic:cNvPicPr/>
                         </pic:nvPicPr>
                         <pic:blipFill>
-                          <a:blip r:embed="rId57"/>
+                          <a:blip r:embed="rId62"/>
                           <a:stretch>
                             <a:fillRect/>
                           </a:stretch>
@@ -9247,7 +9865,7 @@
                           <pic:cNvPicPr/>
                         </pic:nvPicPr>
                         <pic:blipFill>
-                          <a:blip r:embed="rId58"/>
+                          <a:blip r:embed="rId63"/>
                           <a:stretch>
                             <a:fillRect/>
                           </a:stretch>
@@ -9357,7 +9975,7 @@
                           <pic:cNvPicPr/>
                         </pic:nvPicPr>
                         <pic:blipFill>
-                          <a:blip r:embed="rId59"/>
+                          <a:blip r:embed="rId64"/>
                           <a:stretch>
                             <a:fillRect/>
                           </a:stretch>
@@ -9485,7 +10103,7 @@
                           <pic:cNvPicPr/>
                         </pic:nvPicPr>
                         <pic:blipFill>
-                          <a:blip r:embed="rId60"/>
+                          <a:blip r:embed="rId65"/>
                           <a:stretch>
                             <a:fillRect/>
                           </a:stretch>
@@ -9594,7 +10212,15 @@
                 <w:b/>
                 <w:color w:val="171717" w:themeColor="background2" w:themeShade="1A"/>
               </w:rPr>
-              <w:t xml:space="preserve">to change how they are laid out. Flex box naturally arranges them along a row rather than </w:t>
+              <w:t xml:space="preserve">to change </w:t>
+            </w:r>
+            <w:r>
+              <w:rPr>
+                <w:b/>
+                <w:color w:val="171717" w:themeColor="background2" w:themeShade="1A"/>
+              </w:rPr>
+              <w:lastRenderedPageBreak/>
+              <w:t xml:space="preserve">how they are laid out. Flex box naturally arranges them along a row rather than </w:t>
             </w:r>
             <w:r>
               <w:rPr>
@@ -9617,7 +10243,6 @@
                 <w:noProof/>
                 <w:color w:val="171717" w:themeColor="background2" w:themeShade="1A"/>
               </w:rPr>
-              <w:lastRenderedPageBreak/>
               <w:drawing>
                 <wp:anchor distT="0" distB="0" distL="114300" distR="114300" simplePos="0" relativeHeight="252032000" behindDoc="0" locked="0" layoutInCell="1" allowOverlap="1" wp14:anchorId="58334AED" wp14:editId="4A21D204">
                   <wp:simplePos x="0" y="0"/>
@@ -9642,7 +10267,7 @@
                           <pic:cNvPicPr/>
                         </pic:nvPicPr>
                         <pic:blipFill>
-                          <a:blip r:embed="rId61"/>
+                          <a:blip r:embed="rId66"/>
                           <a:stretch>
                             <a:fillRect/>
                           </a:stretch>

</xml_diff>

<commit_message>
Cleaning up my codes structure
</commit_message>
<xml_diff>
--- a/Documentation/Project Breif.docx
+++ b/Documentation/Project Breif.docx
@@ -1517,15 +1517,7 @@
         <w:t xml:space="preserve">I also maintained a detailed, dated worklog throughout my development as a way to show </w:t>
       </w:r>
       <w:r>
-        <w:t xml:space="preserve">my development and debug process as I completed, rather than ticking off individual things on my Trello as I went. My testing tables also have dated records of testing, problems found, changes made (with links back to worklog for debug if necessary), and retests. </w:t>
-      </w:r>
-      <w:proofErr w:type="spellStart"/>
-      <w:r>
-        <w:t>Github</w:t>
-      </w:r>
-      <w:proofErr w:type="spellEnd"/>
-      <w:r>
-        <w:t xml:space="preserve"> shows my VS code commit history.</w:t>
+        <w:t>my development and debug process as I completed, rather than ticking off individual things on my Trello as I went. My testing tables also have dated records of testing, problems found, changes made (with links back to worklog for debug if necessary), and retests. Github shows my VS code commit history.</w:t>
       </w:r>
     </w:p>
     <w:p>
@@ -1613,15 +1605,7 @@
         </w:numPr>
       </w:pPr>
       <w:r>
-        <w:t xml:space="preserve">And my </w:t>
-      </w:r>
-      <w:proofErr w:type="spellStart"/>
-      <w:r>
-        <w:t>github</w:t>
-      </w:r>
-      <w:proofErr w:type="spellEnd"/>
-      <w:r>
-        <w:t xml:space="preserve"> link: </w:t>
+        <w:t xml:space="preserve">And my github link: </w:t>
       </w:r>
       <w:hyperlink r:id="rId16" w:history="1">
         <w:r>
@@ -2793,21 +2777,7 @@
               <w:rPr>
                 <w:highlight w:val="yellow"/>
               </w:rPr>
-              <w:t xml:space="preserve">. I planned two </w:t>
-            </w:r>
-            <w:proofErr w:type="spellStart"/>
-            <w:r>
-              <w:rPr>
-                <w:highlight w:val="yellow"/>
-              </w:rPr>
-              <w:t>fonts</w:t>
-            </w:r>
-            <w:proofErr w:type="spellEnd"/>
-            <w:r>
-              <w:rPr>
-                <w:highlight w:val="yellow"/>
-              </w:rPr>
-              <w:t xml:space="preserve">: urbanist and sensation, two color palettes a pink and a white one, </w:t>
+              <w:t xml:space="preserve">. I planned two fonts: urbanist and sensation, two color palettes a pink and a white one, </w:t>
             </w:r>
             <w:r>
               <w:rPr>
@@ -3376,35 +3346,7 @@
               <w:rPr>
                 <w:highlight w:val="yellow"/>
               </w:rPr>
-              <w:t xml:space="preserve">I built an initial interface, having a small version to show users for early stage testing. It had the most likely combination of fonts and </w:t>
-            </w:r>
-            <w:proofErr w:type="spellStart"/>
-            <w:r>
-              <w:rPr>
-                <w:highlight w:val="yellow"/>
-              </w:rPr>
-              <w:t>colours</w:t>
-            </w:r>
-            <w:proofErr w:type="spellEnd"/>
-            <w:r>
-              <w:rPr>
-                <w:highlight w:val="yellow"/>
-              </w:rPr>
-              <w:t xml:space="preserve"> that I picked, and it had a button element from </w:t>
-            </w:r>
-            <w:proofErr w:type="spellStart"/>
-            <w:r>
-              <w:rPr>
-                <w:highlight w:val="yellow"/>
-              </w:rPr>
-              <w:t>Uiverse</w:t>
-            </w:r>
-            <w:proofErr w:type="spellEnd"/>
-            <w:r>
-              <w:rPr>
-                <w:highlight w:val="yellow"/>
-              </w:rPr>
-              <w:t xml:space="preserve"> to make it look visually appealing. I added the ability to </w:t>
+              <w:t xml:space="preserve">I built an initial interface, having a small version to show users for early stage testing. It had the most likely combination of fonts and colours that I picked, and it had a button element from Uiverse to make it look visually appealing. I added the ability to </w:t>
             </w:r>
             <w:r>
               <w:rPr>
@@ -3869,16 +3811,8 @@
               <w:rPr>
                 <w:highlight w:val="yellow"/>
               </w:rPr>
-              <w:t xml:space="preserve"> </w:t>
-            </w:r>
-            <w:proofErr w:type="spellStart"/>
-            <w:r>
-              <w:rPr>
-                <w:highlight w:val="yellow"/>
-              </w:rPr>
-              <w:t>Relfection</w:t>
-            </w:r>
-            <w:proofErr w:type="spellEnd"/>
+              <w:t xml:space="preserve"> Relfection</w:t>
+            </w:r>
           </w:p>
         </w:tc>
         <w:tc>
@@ -5809,13 +5743,8 @@
       </w:r>
     </w:p>
     <w:p>
-      <w:proofErr w:type="spellStart"/>
       <w:r>
-        <w:t>Color</w:t>
-      </w:r>
-      <w:proofErr w:type="spellEnd"/>
-      <w:r>
-        <w:t xml:space="preserve"> = days until next review</w:t>
+        <w:t>Color = days until next review</w:t>
       </w:r>
     </w:p>
     <w:p>
@@ -5973,19 +5902,11 @@
     </w:p>
     <w:p>
       <w:hyperlink r:id="rId42" w:history="1">
-        <w:proofErr w:type="spellStart"/>
         <w:r>
           <w:rPr>
             <w:rStyle w:val="Hyperlink"/>
           </w:rPr>
-          <w:t>Color</w:t>
-        </w:r>
-        <w:proofErr w:type="spellEnd"/>
-        <w:r>
-          <w:rPr>
-            <w:rStyle w:val="Hyperlink"/>
-          </w:rPr>
-          <w:t xml:space="preserve"> Palette Generator From Image | Adobe Express</w:t>
+          <w:t>Color Palette Generator From Image | Adobe Express</w:t>
         </w:r>
         <w:r>
           <w:rPr>
@@ -6017,16 +5938,8 @@
           <w:rPr>
             <w:rStyle w:val="Hyperlink"/>
           </w:rPr>
-          <w:t xml:space="preserve">Create a Palette - </w:t>
+          <w:t>Create a Palette - Coolors</w:t>
         </w:r>
-        <w:proofErr w:type="spellStart"/>
-        <w:r>
-          <w:rPr>
-            <w:rStyle w:val="Hyperlink"/>
-          </w:rPr>
-          <w:t>Coolors</w:t>
-        </w:r>
-        <w:proofErr w:type="spellEnd"/>
       </w:hyperlink>
       <w:r>
         <w:rPr>
@@ -6173,21 +6086,7 @@
               <w:rPr>
                 <w:sz w:val="20"/>
               </w:rPr>
-              <w:t xml:space="preserve">:root tokens for </w:t>
-            </w:r>
-            <w:proofErr w:type="spellStart"/>
-            <w:r>
-              <w:rPr>
-                <w:sz w:val="20"/>
-              </w:rPr>
-              <w:t>colour</w:t>
-            </w:r>
-            <w:proofErr w:type="spellEnd"/>
-            <w:r>
-              <w:rPr>
-                <w:sz w:val="20"/>
-              </w:rPr>
-              <w:t>, space, type</w:t>
+              <w:t>:root tokens for colour, space, type</w:t>
             </w:r>
           </w:p>
           <w:p>
@@ -7057,19 +6956,25 @@
                 <w:lang w:val="en-NZ"/>
               </w:rPr>
             </w:pPr>
-            <w:proofErr w:type="spellStart"/>
             <w:r>
               <w:rPr>
                 <w:lang w:val="en-NZ"/>
               </w:rPr>
-              <w:t>localStorage.setItem</w:t>
-            </w:r>
-            <w:proofErr w:type="spellEnd"/>
-            <w:r>
+              <w:t>localStorage.setItem(</w:t>
+            </w:r>
+          </w:p>
+          <w:p>
+            <w:pPr>
+              <w:spacing w:before="40" w:after="40"/>
               <w:rPr>
                 <w:lang w:val="en-NZ"/>
               </w:rPr>
-              <w:t>(</w:t>
+            </w:pPr>
+            <w:r>
+              <w:rPr>
+                <w:lang w:val="en-NZ"/>
+              </w:rPr>
+              <w:t xml:space="preserve">    "theses",</w:t>
             </w:r>
           </w:p>
           <w:p>
@@ -7083,7 +6988,7 @@
               <w:rPr>
                 <w:lang w:val="en-NZ"/>
               </w:rPr>
-              <w:t xml:space="preserve">    "theses",</w:t>
+              <w:t xml:space="preserve">    JSON.stringify(theses)</w:t>
             </w:r>
           </w:p>
           <w:p>
@@ -7097,61 +7002,20 @@
               <w:rPr>
                 <w:lang w:val="en-NZ"/>
               </w:rPr>
-              <w:t xml:space="preserve">    </w:t>
-            </w:r>
-            <w:proofErr w:type="spellStart"/>
-            <w:r>
-              <w:rPr>
-                <w:lang w:val="en-NZ"/>
-              </w:rPr>
-              <w:t>JSON.stringify</w:t>
-            </w:r>
-            <w:proofErr w:type="spellEnd"/>
-            <w:r>
-              <w:rPr>
-                <w:lang w:val="en-NZ"/>
-              </w:rPr>
-              <w:t>(theses)</w:t>
+              <w:t>);</w:t>
             </w:r>
           </w:p>
           <w:p>
             <w:pPr>
               <w:spacing w:before="40" w:after="40"/>
-              <w:rPr>
-                <w:lang w:val="en-NZ"/>
-              </w:rPr>
-            </w:pPr>
-            <w:r>
-              <w:rPr>
-                <w:lang w:val="en-NZ"/>
-              </w:rPr>
-              <w:t>);</w:t>
-            </w:r>
+            </w:pPr>
           </w:p>
           <w:p>
             <w:pPr>
               <w:spacing w:before="40" w:after="40"/>
             </w:pPr>
-          </w:p>
-          <w:p>
-            <w:pPr>
-              <w:spacing w:before="40" w:after="40"/>
-            </w:pPr>
-            <w:proofErr w:type="spellStart"/>
-            <w:r>
-              <w:t>JSON.stringify</w:t>
-            </w:r>
-            <w:proofErr w:type="spellEnd"/>
-            <w:r>
-              <w:t xml:space="preserve">() converts the </w:t>
-            </w:r>
-            <w:proofErr w:type="spellStart"/>
-            <w:r>
-              <w:t>javascript</w:t>
-            </w:r>
-            <w:proofErr w:type="spellEnd"/>
-            <w:r>
-              <w:t xml:space="preserve"> array of thesis objects into a JSON string before saving it</w:t>
+            <w:r>
+              <w:t>JSON.stringify() converts the javascript array of thesis objects into a JSON string before saving it</w:t>
             </w:r>
           </w:p>
           <w:p>
@@ -7248,15 +7112,7 @@
               <w:spacing w:before="40" w:after="40"/>
             </w:pPr>
             <w:r>
-              <w:t xml:space="preserve">Json and </w:t>
-            </w:r>
-            <w:proofErr w:type="spellStart"/>
-            <w:r>
-              <w:t>localstorage</w:t>
-            </w:r>
-            <w:proofErr w:type="spellEnd"/>
-            <w:r>
-              <w:t xml:space="preserve"> to save users thesis parts. The data will be accessible in the users ‘saved theses’ box on the home page of the dashboard. </w:t>
+              <w:t xml:space="preserve">Json and localstorage to save users thesis parts. The data will be accessible in the users ‘saved theses’ box on the home page of the dashboard. </w:t>
             </w:r>
             <w:r>
               <w:br/>
@@ -7558,16 +7414,8 @@
               <w:rPr>
                 <w:sz w:val="20"/>
               </w:rPr>
-              <w:t xml:space="preserve">Asset pipeline / </w:t>
-            </w:r>
-            <w:proofErr w:type="spellStart"/>
-            <w:r>
-              <w:rPr>
-                <w:sz w:val="20"/>
-              </w:rPr>
-              <w:t>optimisation</w:t>
-            </w:r>
-            <w:proofErr w:type="spellEnd"/>
+              <w:t>Asset pipeline / optimisation</w:t>
+            </w:r>
           </w:p>
         </w:tc>
         <w:tc>
@@ -7679,8 +7527,8 @@
       <w:tblGrid>
         <w:gridCol w:w="1617"/>
         <w:gridCol w:w="2353"/>
-        <w:gridCol w:w="3685"/>
-        <w:gridCol w:w="3828"/>
+        <w:gridCol w:w="2977"/>
+        <w:gridCol w:w="4536"/>
       </w:tblGrid>
       <w:tr>
         <w:tc>
@@ -7733,7 +7581,7 @@
         </w:tc>
         <w:tc>
           <w:tcPr>
-            <w:tcW w:w="3685" w:type="dxa"/>
+            <w:tcW w:w="2977" w:type="dxa"/>
           </w:tcPr>
           <w:p>
             <w:pPr>
@@ -7766,7 +7614,7 @@
         </w:tc>
         <w:tc>
           <w:tcPr>
-            <w:tcW w:w="3828" w:type="dxa"/>
+            <w:tcW w:w="4536" w:type="dxa"/>
           </w:tcPr>
           <w:p>
             <w:pPr>
@@ -8032,7 +7880,7 @@
         </w:tc>
         <w:tc>
           <w:tcPr>
-            <w:tcW w:w="3685" w:type="dxa"/>
+            <w:tcW w:w="2977" w:type="dxa"/>
           </w:tcPr>
           <w:p>
             <w:pPr>
@@ -8158,6 +8006,7 @@
                 <w:szCs w:val="24"/>
                 <w:lang w:val="en-NZ"/>
               </w:rPr>
+              <w:lastRenderedPageBreak/>
               <w:t xml:space="preserve">I also added </w:t>
             </w:r>
             <w:r>
@@ -8188,18 +8037,7 @@
                 <w:szCs w:val="24"/>
                 <w:lang w:val="en-NZ"/>
               </w:rPr>
-              <w:t xml:space="preserve">creates a hierarchy. Screen readers use headings as navigation landmarks, allowing users to jump around the </w:t>
-            </w:r>
-            <w:r>
-              <w:rPr>
-                <w:b/>
-                <w:color w:val="171717" w:themeColor="background2" w:themeShade="1A"/>
-                <w:sz w:val="24"/>
-                <w:szCs w:val="24"/>
-                <w:lang w:val="en-NZ"/>
-              </w:rPr>
-              <w:lastRenderedPageBreak/>
-              <w:t>screen by headings rather than listening to every piece of text.</w:t>
+              <w:t>creates a hierarchy. Screen readers use headings as navigation landmarks, allowing users to jump around the screen by headings rather than listening to every piece of text.</w:t>
             </w:r>
           </w:p>
           <w:p>
@@ -8345,7 +8183,7 @@
         </w:tc>
         <w:tc>
           <w:tcPr>
-            <w:tcW w:w="3828" w:type="dxa"/>
+            <w:tcW w:w="4536" w:type="dxa"/>
           </w:tcPr>
           <w:p>
             <w:pPr>
@@ -9263,7 +9101,7 @@
         </w:tc>
         <w:tc>
           <w:tcPr>
-            <w:tcW w:w="3685" w:type="dxa"/>
+            <w:tcW w:w="2977" w:type="dxa"/>
           </w:tcPr>
           <w:p>
             <w:pPr>
@@ -9364,17 +9202,7 @@
                 <w:sz w:val="24"/>
                 <w:szCs w:val="24"/>
               </w:rPr>
-              <w:t xml:space="preserve">I also provide information about how their data is </w:t>
-            </w:r>
-            <w:r>
-              <w:rPr>
-                <w:b/>
-                <w:color w:val="171717" w:themeColor="background2" w:themeShade="1A"/>
-                <w:sz w:val="24"/>
-                <w:szCs w:val="24"/>
-              </w:rPr>
-              <w:lastRenderedPageBreak/>
-              <w:t>collected and warn users not to enter personal information they do not wish to share, as this may be visible to other users with access to the same device.</w:t>
+              <w:t>I also provide information about how their data is collected and warn users not to enter personal information they do not wish to share, as this may be visible to other users with access to the same device.</w:t>
             </w:r>
           </w:p>
           <w:p>
@@ -9454,7 +9282,7 @@
         </w:tc>
         <w:tc>
           <w:tcPr>
-            <w:tcW w:w="3828" w:type="dxa"/>
+            <w:tcW w:w="4536" w:type="dxa"/>
           </w:tcPr>
           <w:p>
             <w:pPr>
@@ -9471,7 +9299,6 @@
                 <w:noProof/>
                 <w:color w:val="171717" w:themeColor="background2" w:themeShade="1A"/>
               </w:rPr>
-              <w:lastRenderedPageBreak/>
               <w:drawing>
                 <wp:anchor distT="0" distB="0" distL="114300" distR="114300" simplePos="0" relativeHeight="252023808" behindDoc="0" locked="0" layoutInCell="1" allowOverlap="1" wp14:anchorId="68E6AD00" wp14:editId="0DF8ABFA">
                   <wp:simplePos x="0" y="0"/>
@@ -9571,6 +9398,7 @@
               <w:rPr>
                 <w:sz w:val="20"/>
               </w:rPr>
+              <w:lastRenderedPageBreak/>
               <w:t>Aesthetics / functionality</w:t>
             </w:r>
           </w:p>
@@ -9604,7 +9432,7 @@
         </w:tc>
         <w:tc>
           <w:tcPr>
-            <w:tcW w:w="3685" w:type="dxa"/>
+            <w:tcW w:w="2977" w:type="dxa"/>
           </w:tcPr>
           <w:p>
             <w:pPr>
@@ -9618,23 +9446,7 @@
                 <w:b/>
                 <w:color w:val="171717" w:themeColor="background2" w:themeShade="1A"/>
               </w:rPr>
-              <w:t xml:space="preserve">I used </w:t>
-            </w:r>
-            <w:proofErr w:type="spellStart"/>
-            <w:r>
-              <w:rPr>
-                <w:b/>
-                <w:color w:val="171717" w:themeColor="background2" w:themeShade="1A"/>
-              </w:rPr>
-              <w:t>css</w:t>
-            </w:r>
-            <w:proofErr w:type="spellEnd"/>
-            <w:r>
-              <w:rPr>
-                <w:b/>
-                <w:color w:val="171717" w:themeColor="background2" w:themeShade="1A"/>
-              </w:rPr>
-              <w:t xml:space="preserve"> </w:t>
+              <w:t xml:space="preserve">I used css </w:t>
             </w:r>
             <w:r>
               <w:rPr>
@@ -9780,15 +9592,7 @@
                 <w:b/>
                 <w:color w:val="171717" w:themeColor="background2" w:themeShade="1A"/>
               </w:rPr>
-              <w:t xml:space="preserve">shows the implication of aesthetics and </w:t>
-            </w:r>
-            <w:r>
-              <w:rPr>
-                <w:b/>
-                <w:color w:val="171717" w:themeColor="background2" w:themeShade="1A"/>
-              </w:rPr>
-              <w:lastRenderedPageBreak/>
-              <w:t xml:space="preserve">functionality because they ensure my interface is always </w:t>
+              <w:t xml:space="preserve">shows the implication of aesthetics and functionality because they ensure my interface is always </w:t>
             </w:r>
             <w:r>
               <w:rPr>
@@ -9801,7 +9605,7 @@
         </w:tc>
         <w:tc>
           <w:tcPr>
-            <w:tcW w:w="3828" w:type="dxa"/>
+            <w:tcW w:w="4536" w:type="dxa"/>
           </w:tcPr>
           <w:p>
             <w:pPr>
@@ -9816,7 +9620,6 @@
                 <w:noProof/>
                 <w:color w:val="171717" w:themeColor="background2" w:themeShade="1A"/>
               </w:rPr>
-              <w:lastRenderedPageBreak/>
               <w:drawing>
                 <wp:anchor distT="0" distB="0" distL="114300" distR="114300" simplePos="0" relativeHeight="251950080" behindDoc="0" locked="0" layoutInCell="1" allowOverlap="1" wp14:anchorId="2EA4CE58" wp14:editId="4409A716">
                   <wp:simplePos x="0" y="0"/>
@@ -10134,7 +9937,6 @@
                 <w:noProof/>
                 <w:color w:val="171717" w:themeColor="background2" w:themeShade="1A"/>
               </w:rPr>
-              <w:lastRenderedPageBreak/>
               <w:drawing>
                 <wp:anchor distT="0" distB="0" distL="114300" distR="114300" simplePos="0" relativeHeight="252029952" behindDoc="0" locked="0" layoutInCell="1" allowOverlap="1" wp14:anchorId="114AE9E7" wp14:editId="6458ABB0">
                   <wp:simplePos x="0" y="0"/>
@@ -10291,6 +10093,7 @@
                 <w:noProof/>
                 <w:color w:val="171717" w:themeColor="background2" w:themeShade="1A"/>
               </w:rPr>
+              <w:lastRenderedPageBreak/>
               <w:drawing>
                 <wp:anchor distT="0" distB="0" distL="114300" distR="114300" simplePos="0" relativeHeight="252032000" behindDoc="0" locked="0" layoutInCell="1" allowOverlap="1" wp14:anchorId="58334AED" wp14:editId="4A21D204">
                   <wp:simplePos x="0" y="0"/>
@@ -10424,21 +10227,323 @@
         </w:tc>
         <w:tc>
           <w:tcPr>
-            <w:tcW w:w="3685" w:type="dxa"/>
+            <w:tcW w:w="2977" w:type="dxa"/>
           </w:tcPr>
           <w:p>
             <w:pPr>
               <w:rPr>
                 <w:b/>
                 <w:color w:val="171717" w:themeColor="background2" w:themeShade="1A"/>
+                <w:lang w:val="en-NZ"/>
+              </w:rPr>
+            </w:pPr>
+            <w:r>
+              <w:rPr>
+                <w:b/>
+                <w:color w:val="171717" w:themeColor="background2" w:themeShade="1A"/>
+              </w:rPr>
+              <w:t>I identified that the button I sourced from UIVERSE was originally created by cssbuttons-io by the link</w:t>
+            </w:r>
+            <w:r>
+              <w:rPr>
+                <w:b/>
+                <w:color w:val="171717" w:themeColor="background2" w:themeShade="1A"/>
+              </w:rPr>
+              <w:t xml:space="preserve">: </w:t>
+            </w:r>
+            <w:hyperlink r:id="rId68" w:history="1">
+              <w:r>
+                <w:rPr>
+                  <w:rStyle w:val="Hyperlink"/>
+                  <w:b/>
+                  <w:i/>
+                  <w:iCs/>
+                  <w:lang w:val="en-NZ"/>
+                </w:rPr>
+                <w:t>https://uiverse.io/cssbuttons-io/funny-dog-69</w:t>
+              </w:r>
+            </w:hyperlink>
+            <w:r>
+              <w:rPr>
+                <w:b/>
+                <w:i/>
+                <w:iCs/>
+                <w:color w:val="171717" w:themeColor="background2" w:themeShade="1A"/>
+                <w:lang w:val="en-NZ"/>
+              </w:rPr>
+              <w:t xml:space="preserve">. </w:t>
+            </w:r>
+            <w:r>
+              <w:rPr>
+                <w:b/>
+                <w:color w:val="171717" w:themeColor="background2" w:themeShade="1A"/>
+                <w:lang w:val="en-NZ"/>
+              </w:rPr>
+              <w:t xml:space="preserve">I added a code comment </w:t>
+            </w:r>
+            <w:r>
+              <w:rPr>
+                <w:b/>
+                <w:color w:val="171717" w:themeColor="background2" w:themeShade="1A"/>
+                <w:lang w:val="en-NZ"/>
+              </w:rPr>
+              <w:t xml:space="preserve">directly at the start and one at the end of the buttons code that I had copied in from </w:t>
+            </w:r>
+            <w:r>
+              <w:rPr>
+                <w:b/>
+                <w:color w:val="171717" w:themeColor="background2" w:themeShade="1A"/>
+                <w:lang w:val="en-NZ"/>
+              </w:rPr>
+              <w:t>UI vers</w:t>
+            </w:r>
+            <w:r>
+              <w:rPr>
+                <w:b/>
+                <w:color w:val="171717" w:themeColor="background2" w:themeShade="1A"/>
+              </w:rPr>
+              <w:t>e</w:t>
+            </w:r>
+            <w:r>
+              <w:rPr>
+                <w:b/>
+                <w:color w:val="171717" w:themeColor="background2" w:themeShade="1A"/>
+                <w:lang w:val="en-NZ"/>
+              </w:rPr>
+              <w:t xml:space="preserve"> to credit </w:t>
+            </w:r>
+            <w:r>
+              <w:rPr>
+                <w:b/>
+                <w:color w:val="171717" w:themeColor="background2" w:themeShade="1A"/>
+                <w:lang w:val="en-NZ"/>
+              </w:rPr>
+              <w:t xml:space="preserve">the creator for making it, ensuring that anyone who views my code knows that I didn’t create it. </w:t>
+            </w:r>
+          </w:p>
+          <w:p>
+            <w:pPr>
+              <w:rPr>
+                <w:b/>
+                <w:color w:val="171717" w:themeColor="background2" w:themeShade="1A"/>
+                <w:lang w:val="en-NZ"/>
+              </w:rPr>
+            </w:pPr>
+          </w:p>
+          <w:p>
+            <w:pPr>
+              <w:rPr>
+                <w:b/>
+                <w:color w:val="171717" w:themeColor="background2" w:themeShade="1A"/>
+                <w:lang w:val="en-NZ"/>
+              </w:rPr>
+            </w:pPr>
+            <w:r>
+              <w:rPr>
+                <w:b/>
+                <w:color w:val="171717" w:themeColor="background2" w:themeShade="1A"/>
+                <w:lang w:val="en-NZ"/>
+              </w:rPr>
+              <w:t>This addresses the IP implication as it addresses third party work, as well as acknowledging the original creator.</w:t>
+            </w:r>
+          </w:p>
+          <w:p>
+            <w:pPr>
+              <w:rPr>
+                <w:b/>
+                <w:color w:val="171717" w:themeColor="background2" w:themeShade="1A"/>
+                <w:lang w:val="en-NZ"/>
+              </w:rPr>
+            </w:pPr>
+          </w:p>
+          <w:p>
+            <w:pPr>
+              <w:rPr>
+                <w:b/>
+                <w:color w:val="171717" w:themeColor="background2" w:themeShade="1A"/>
+                <w:lang w:val="en-NZ"/>
+              </w:rPr>
+            </w:pPr>
+            <w:r>
+              <w:rPr>
+                <w:b/>
+                <w:color w:val="171717" w:themeColor="background2" w:themeShade="1A"/>
+                <w:lang w:val="en-NZ"/>
+              </w:rPr>
+              <w:t>I did a very similar thing with my loading screen, adding a comment to the top and bottom of the css containing creator, link, licence, and date of implementation to ensure this element is credited correctly.</w:t>
+            </w:r>
+          </w:p>
+          <w:p>
+            <w:pPr>
+              <w:rPr>
+                <w:b/>
+                <w:color w:val="171717" w:themeColor="background2" w:themeShade="1A"/>
+                <w:lang w:val="en-NZ"/>
               </w:rPr>
             </w:pPr>
           </w:p>
         </w:tc>
         <w:tc>
           <w:tcPr>
-            <w:tcW w:w="3828" w:type="dxa"/>
+            <w:tcW w:w="4536" w:type="dxa"/>
           </w:tcPr>
+          <w:p>
+            <w:pPr>
+              <w:rPr>
+                <w:b/>
+                <w:noProof/>
+                <w:color w:val="171717" w:themeColor="background2" w:themeShade="1A"/>
+              </w:rPr>
+            </w:pPr>
+            <w:r>
+              <w:rPr>
+                <w:b/>
+                <w:noProof/>
+                <w:color w:val="171717" w:themeColor="background2" w:themeShade="1A"/>
+              </w:rPr>
+              <w:drawing>
+                <wp:anchor distT="0" distB="0" distL="114300" distR="114300" simplePos="0" relativeHeight="252054528" behindDoc="0" locked="0" layoutInCell="1" allowOverlap="1" wp14:anchorId="21AD040D" wp14:editId="49D9A3B6">
+                  <wp:simplePos x="0" y="0"/>
+                  <wp:positionH relativeFrom="column">
+                    <wp:posOffset>9232</wp:posOffset>
+                  </wp:positionH>
+                  <wp:positionV relativeFrom="paragraph">
+                    <wp:posOffset>449140</wp:posOffset>
+                  </wp:positionV>
+                  <wp:extent cx="2525649" cy="1198494"/>
+                  <wp:effectExtent l="0" t="0" r="8255" b="1905"/>
+                  <wp:wrapSquare wrapText="bothSides"/>
+                  <wp:docPr id="1166247211" name="Picture 1"/>
+                  <wp:cNvGraphicFramePr>
+                    <a:graphicFrameLocks xmlns:a="http://schemas.openxmlformats.org/drawingml/2006/main" noChangeAspect="1"/>
+                  </wp:cNvGraphicFramePr>
+                  <a:graphic xmlns:a="http://schemas.openxmlformats.org/drawingml/2006/main">
+                    <a:graphicData uri="http://schemas.openxmlformats.org/drawingml/2006/picture">
+                      <pic:pic xmlns:pic="http://schemas.openxmlformats.org/drawingml/2006/picture">
+                        <pic:nvPicPr>
+                          <pic:cNvPr id="1166247211" name=""/>
+                          <pic:cNvPicPr/>
+                        </pic:nvPicPr>
+                        <pic:blipFill>
+                          <a:blip r:embed="rId69"/>
+                          <a:stretch>
+                            <a:fillRect/>
+                          </a:stretch>
+                        </pic:blipFill>
+                        <pic:spPr>
+                          <a:xfrm>
+                            <a:off x="0" y="0"/>
+                            <a:ext cx="2525649" cy="1198494"/>
+                          </a:xfrm>
+                          <a:prstGeom prst="rect">
+                            <a:avLst/>
+                          </a:prstGeom>
+                        </pic:spPr>
+                      </pic:pic>
+                    </a:graphicData>
+                  </a:graphic>
+                  <wp14:sizeRelH relativeFrom="margin">
+                    <wp14:pctWidth>0</wp14:pctWidth>
+                  </wp14:sizeRelH>
+                  <wp14:sizeRelV relativeFrom="margin">
+                    <wp14:pctHeight>0</wp14:pctHeight>
+                  </wp14:sizeRelV>
+                </wp:anchor>
+              </w:drawing>
+            </w:r>
+            <w:r>
+              <w:rPr>
+                <w:b/>
+                <w:noProof/>
+                <w:color w:val="171717" w:themeColor="background2" w:themeShade="1A"/>
+              </w:rPr>
+              <w:t xml:space="preserve">Image of the </w:t>
+            </w:r>
+            <w:r>
+              <w:rPr>
+                <w:b/>
+                <w:noProof/>
+                <w:color w:val="171717" w:themeColor="background2" w:themeShade="1A"/>
+              </w:rPr>
+              <w:t>code comment placed above my button code:</w:t>
+            </w:r>
+          </w:p>
+          <w:p>
+            <w:pPr>
+              <w:rPr>
+                <w:b/>
+                <w:noProof/>
+                <w:color w:val="171717" w:themeColor="background2" w:themeShade="1A"/>
+              </w:rPr>
+            </w:pPr>
+          </w:p>
+          <w:p>
+            <w:pPr>
+              <w:rPr>
+                <w:b/>
+                <w:noProof/>
+                <w:color w:val="171717" w:themeColor="background2" w:themeShade="1A"/>
+              </w:rPr>
+            </w:pPr>
+            <w:r>
+              <w:rPr>
+                <w:b/>
+                <w:noProof/>
+                <w:color w:val="171717" w:themeColor="background2" w:themeShade="1A"/>
+              </w:rPr>
+              <w:drawing>
+                <wp:anchor distT="0" distB="0" distL="114300" distR="114300" simplePos="0" relativeHeight="252056576" behindDoc="0" locked="0" layoutInCell="1" allowOverlap="1" wp14:anchorId="57656C3F" wp14:editId="5C16D4D0">
+                  <wp:simplePos x="0" y="0"/>
+                  <wp:positionH relativeFrom="column">
+                    <wp:posOffset>-37221</wp:posOffset>
+                  </wp:positionH>
+                  <wp:positionV relativeFrom="paragraph">
+                    <wp:posOffset>590501</wp:posOffset>
+                  </wp:positionV>
+                  <wp:extent cx="2743200" cy="1440815"/>
+                  <wp:effectExtent l="0" t="0" r="0" b="6985"/>
+                  <wp:wrapSquare wrapText="bothSides"/>
+                  <wp:docPr id="794856760" name="Picture 1"/>
+                  <wp:cNvGraphicFramePr>
+                    <a:graphicFrameLocks xmlns:a="http://schemas.openxmlformats.org/drawingml/2006/main" noChangeAspect="1"/>
+                  </wp:cNvGraphicFramePr>
+                  <a:graphic xmlns:a="http://schemas.openxmlformats.org/drawingml/2006/main">
+                    <a:graphicData uri="http://schemas.openxmlformats.org/drawingml/2006/picture">
+                      <pic:pic xmlns:pic="http://schemas.openxmlformats.org/drawingml/2006/picture">
+                        <pic:nvPicPr>
+                          <pic:cNvPr id="794856760" name=""/>
+                          <pic:cNvPicPr/>
+                        </pic:nvPicPr>
+                        <pic:blipFill>
+                          <a:blip r:embed="rId70"/>
+                          <a:stretch>
+                            <a:fillRect/>
+                          </a:stretch>
+                        </pic:blipFill>
+                        <pic:spPr>
+                          <a:xfrm>
+                            <a:off x="0" y="0"/>
+                            <a:ext cx="2743200" cy="1440815"/>
+                          </a:xfrm>
+                          <a:prstGeom prst="rect">
+                            <a:avLst/>
+                          </a:prstGeom>
+                        </pic:spPr>
+                      </pic:pic>
+                    </a:graphicData>
+                  </a:graphic>
+                </wp:anchor>
+              </w:drawing>
+            </w:r>
+            <w:r>
+              <w:rPr>
+                <w:b/>
+                <w:noProof/>
+                <w:color w:val="171717" w:themeColor="background2" w:themeShade="1A"/>
+              </w:rPr>
+              <w:t xml:space="preserve">I also did the same thing with my loading screen (code comment crediting the original creator): </w:t>
+            </w:r>
+          </w:p>
           <w:p>
             <w:pPr>
               <w:rPr>
@@ -10478,7 +10583,7 @@
         </w:tc>
         <w:tc>
           <w:tcPr>
-            <w:tcW w:w="3685" w:type="dxa"/>
+            <w:tcW w:w="2977" w:type="dxa"/>
           </w:tcPr>
           <w:p>
             <w:pPr>
@@ -10491,7 +10596,7 @@
         </w:tc>
         <w:tc>
           <w:tcPr>
-            <w:tcW w:w="3828" w:type="dxa"/>
+            <w:tcW w:w="4536" w:type="dxa"/>
           </w:tcPr>
           <w:p>
             <w:pPr>
@@ -10532,7 +10637,7 @@
         </w:tc>
         <w:tc>
           <w:tcPr>
-            <w:tcW w:w="3685" w:type="dxa"/>
+            <w:tcW w:w="2977" w:type="dxa"/>
           </w:tcPr>
           <w:p>
             <w:pPr>
@@ -10545,7 +10650,7 @@
         </w:tc>
         <w:tc>
           <w:tcPr>
-            <w:tcW w:w="3828" w:type="dxa"/>
+            <w:tcW w:w="4536" w:type="dxa"/>
           </w:tcPr>
           <w:p>
             <w:pPr>
@@ -13176,7 +13281,6 @@
   <w:style w:type="character" w:default="1" w:styleId="DefaultParagraphFont">
     <w:name w:val="Default Paragraph Font"/>
     <w:uiPriority w:val="1"/>
-    <w:semiHidden/>
     <w:unhideWhenUsed/>
   </w:style>
   <w:style w:type="table" w:default="1" w:styleId="TableNormal">

</xml_diff>